<commit_message>
Word documents v1.1 for the Habmann feedback: trainer documents, lesson plan, AI notice, Document use sheet
- Add a Trainer document per day (Day 1-8): coaching UE4, case-study and transfer model solutions, feedback round, assessment criteria, transition from Level 2 to 3
- Add "Day at a glance" (UE1-UE10) to every document; mark case study 2 UE (UE5-6) and transfer project 3 UE (UE8-10); UE column in the Task coverage tables
- Add AI notice (EN/DE), version 1.1, release date 14.10.2026 and named approver to every cover and footer; label every figure with "AI" on the image
- Add block orientation to the Day 1 Materi, a "Use in class: presentation and handout" table and the playground addresses to every document
- Add the sheet "Document use Day 1-8" to the One Stop plan workbook
- CLAUDE.md #53 (Word-only rules); correct #50: the plan merges UE8-10 into the transfer project

Co-Authored-By: Claude Sonnet 5.5 <noreply@anthropic.com>
</commit_message>
<xml_diff>
--- a/materi-task-docx/Day1-Materi-Habmann-Digital-Learning-UX-vs-UI-and-User-Centred-Design.docx
+++ b/materi-task-docx/Day1-Materi-Habmann-Digital-Learning-UX-vs-UI-and-User-Centred-Design.docx
@@ -54,6 +54,77 @@
     </w:p>
     <w:tbl>
       <w:tblPr>
+        <w:tblW w:w="9598" w:type="dxa"/>
+        <w:tblBorders>
+          <w:top w:val="single" w:sz="4" w:space="0" w:color="8793A3"/>
+          <w:left w:val="single" w:sz="4" w:space="0" w:color="8793A3"/>
+          <w:bottom w:val="single" w:sz="4" w:space="0" w:color="8793A3"/>
+          <w:right w:val="single" w:sz="4" w:space="0" w:color="8793A3"/>
+        </w:tblBorders>
+        <w:tblLayout w:type="fixed"/>
+        <w:tblCellMar>
+          <w:top w:w="90" w:type="dxa"/>
+          <w:left w:w="160" w:type="dxa"/>
+          <w:bottom w:w="90" w:type="dxa"/>
+          <w:right w:w="160" w:type="dxa"/>
+        </w:tblCellMar>
+      </w:tblPr>
+      <w:tblGrid>
+        <w:gridCol w:w="9598"/>
+      </w:tblGrid>
+      <w:tr>
+        <w:tc>
+          <w:tcPr>
+            <w:tcW w:type="dxa" w:w="9598"/>
+            <w:tcBorders>
+              <w:left w:val="single" w:sz="28" w:space="0" w:color="8793A3"/>
+            </w:tcBorders>
+            <w:shd w:val="clear" w:color="auto" w:fill="FFFFFF"/>
+          </w:tcPr>
+          <w:p>
+            <w:pPr>
+              <w:keepNext/>
+              <w:spacing w:before="0" w:after="60"/>
+            </w:pPr>
+            <w:r>
+              <w:rPr>
+                <w:b/>
+                <w:color w:val="8793A3"/>
+                <w:sz w:val="20"/>
+              </w:rPr>
+              <w:t>AI notice · KI-Hinweis</w:t>
+            </w:r>
+          </w:p>
+          <w:p>
+            <w:pPr>
+              <w:spacing w:before="0" w:after="100"/>
+            </w:pPr>
+            <w:r>
+              <w:rPr/>
+              <w:t>This document was produced with the help of an AI language model (Claude, Anthropic). The AI drafted the text and tables and drew the diagrams from code. The content was then read, corrected and approved by the reviewer named below, who is responsible for its accuracy. Every diagram carries an AI label on the image. Check figures and sources before you quote them.</w:t>
+            </w:r>
+          </w:p>
+          <w:p>
+            <w:pPr>
+              <w:spacing w:before="0" w:after="100"/>
+            </w:pPr>
+            <w:r>
+              <w:rPr>
+                <w:i/>
+              </w:rPr>
+              <w:t>KI-Hinweis: Dieses Dokument wurde mit Unterstützung eines KI-Sprachmodells (Claude, Anthropic) erstellt. Texte und Tabellen wurden von der KI entworfen, die Abbildungen sind KI-generiert und am Bild gekennzeichnet. Die fachliche Prüfung und Freigabe erfolgte durch die unten genannte Person.</w:t>
+            </w:r>
+          </w:p>
+        </w:tc>
+      </w:tr>
+    </w:tbl>
+    <w:p>
+      <w:pPr>
+        <w:spacing w:before="0" w:after="80"/>
+      </w:pPr>
+    </w:p>
+    <w:tbl>
+      <w:tblPr>
         <w:tblW w:w="9638" w:type="dxa"/>
         <w:tblBorders>
           <w:top w:val="single" w:sz="4" w:space="0" w:color="D5DEE9"/>
@@ -239,7 +310,7 @@
                 <w:color w:val="556274"/>
                 <w:sz w:val="19"/>
               </w:rPr>
-              <w:t>Website (playground)</w:t>
+              <w:t>Playground (website)</w:t>
             </w:r>
           </w:p>
         </w:tc>
@@ -255,7 +326,7 @@
               <w:rPr>
                 <w:sz w:val="20"/>
               </w:rPr>
-              <w:t>https://aion-dl.vercel.app/day/1/ (Route 1: /day/1/route-1/ · Route 2: /day/1/route-2/)</w:t>
+              <w:t>https://aion-dl.vercel.app/day/1/</w:t>
             </w:r>
           </w:p>
         </w:tc>
@@ -293,6 +364,80 @@
                 <w:sz w:val="20"/>
               </w:rPr>
               <w:t>Worked examples use LearnLoop, an online-course provider. The task case is SkillUp GmbH and its platform LearnFast (see the Task document).</w:t>
+            </w:r>
+          </w:p>
+        </w:tc>
+      </w:tr>
+      <w:tr>
+        <w:tc>
+          <w:tcPr>
+            <w:tcW w:type="dxa" w:w="2300"/>
+            <w:shd w:val="clear" w:color="auto" w:fill="E6ECF4"/>
+          </w:tcPr>
+          <w:p>
+            <w:pPr>
+              <w:spacing w:before="0" w:after="0"/>
+            </w:pPr>
+            <w:r>
+              <w:rPr>
+                <w:b/>
+                <w:color w:val="556274"/>
+                <w:sz w:val="19"/>
+              </w:rPr>
+              <w:t>Version</w:t>
+            </w:r>
+          </w:p>
+        </w:tc>
+        <w:tc>
+          <w:tcPr>
+            <w:tcW w:type="dxa" w:w="7338"/>
+          </w:tcPr>
+          <w:p>
+            <w:pPr>
+              <w:spacing w:before="0" w:after="0"/>
+            </w:pPr>
+            <w:r>
+              <w:rPr>
+                <w:sz w:val="20"/>
+              </w:rPr>
+              <w:t>1.1 · release date 14.10.2026</w:t>
+            </w:r>
+          </w:p>
+        </w:tc>
+      </w:tr>
+      <w:tr>
+        <w:tc>
+          <w:tcPr>
+            <w:tcW w:type="dxa" w:w="2300"/>
+            <w:shd w:val="clear" w:color="auto" w:fill="E6ECF4"/>
+          </w:tcPr>
+          <w:p>
+            <w:pPr>
+              <w:spacing w:before="0" w:after="0"/>
+            </w:pPr>
+            <w:r>
+              <w:rPr>
+                <w:b/>
+                <w:color w:val="556274"/>
+                <w:sz w:val="19"/>
+              </w:rPr>
+              <w:t>Review and approval</w:t>
+            </w:r>
+          </w:p>
+        </w:tc>
+        <w:tc>
+          <w:tcPr>
+            <w:tcW w:type="dxa" w:w="7338"/>
+          </w:tcPr>
+          <w:p>
+            <w:pPr>
+              <w:spacing w:before="0" w:after="0"/>
+            </w:pPr>
+            <w:r>
+              <w:rPr>
+                <w:sz w:val="20"/>
+              </w:rPr>
+              <w:t>Muhammad Muchson, Mentor (subject-matter review and approval)</w:t>
             </w:r>
           </w:p>
         </w:tc>
@@ -351,6 +496,21 @@
               <w:spacing w:before="0" w:after="100"/>
             </w:pPr>
             <w:r>
+              <w:rPr>
+                <w:b/>
+              </w:rPr>
+              <w:t>In class we also use the playground, the course website, as the place to practise and learn.</w:t>
+            </w:r>
+            <w:r>
+              <w:rPr/>
+              <w:t xml:space="preserve"> Its address is at the end of this document.</w:t>
+            </w:r>
+          </w:p>
+          <w:p>
+            <w:pPr>
+              <w:spacing w:before="0" w:after="100"/>
+            </w:pPr>
+            <w:r>
               <w:rPr/>
               <w:t>This document holds everything you need to study Day 1 without the website. It is written to be read from top to bottom. Every card says what the idea is in plain words, shows it in a picture, gives the details, and ends with the rules you will use in the Task document. Cards marked Optional are not needed for the Core blocks of the task. The worked examples use a different company (LearnLoop) so that no task answer is printed here. Glossary and references are at the end.</w:t>
             </w:r>
@@ -362,6 +522,11 @@
       <w:pPr>
         <w:spacing w:before="0" w:after="80"/>
       </w:pPr>
+    </w:p>
+    <w:p>
+      <w:r>
+        <w:br w:type="page"/>
+      </w:r>
     </w:p>
     <w:p/>
     <w:tbl>
@@ -385,6 +550,9 @@
         <w:gridCol w:w="9598"/>
       </w:tblGrid>
       <w:tr>
+        <w:trPr>
+          <w:cantSplit/>
+        </w:trPr>
         <w:tc>
           <w:tcPr>
             <w:tcW w:type="dxa" w:w="9598"/>
@@ -415,7 +583,7 @@
               <w:rPr>
                 <w:sz w:val="20"/>
               </w:rPr>
-              <w:t>A1 · UX is the experience, UI is the surface · 10 min · Core</w:t>
+              <w:t>Lesson plan: ten teaching units (Ablaufplan)</w:t>
             </w:r>
           </w:p>
           <w:p>
@@ -427,7 +595,7 @@
               <w:rPr>
                 <w:sz w:val="20"/>
               </w:rPr>
-              <w:t>A2 · Design from the learner's need, not from the system's logic · 12 min · Core</w:t>
+              <w:t>Case study and transfer project at a glance</w:t>
             </w:r>
           </w:p>
           <w:p>
@@ -439,7 +607,7 @@
               <w:rPr>
                 <w:sz w:val="20"/>
               </w:rPr>
-              <w:t>A3 · Three principles of a good learning interface · 14 min · Core</w:t>
+              <w:t>The course: sixteen days, eight modules</w:t>
             </w:r>
           </w:p>
           <w:p>
@@ -451,7 +619,7 @@
               <w:rPr>
                 <w:sz w:val="20"/>
               </w:rPr>
-              <w:t>A4 · A learning platform is not a classic app · 10 min · Optional</w:t>
+              <w:t>How every day runs</w:t>
             </w:r>
           </w:p>
           <w:p>
@@ -463,7 +631,7 @@
               <w:rPr>
                 <w:sz w:val="20"/>
               </w:rPr>
-              <w:t>A5 · Weighing a measure: user impact, effort, risk · 14 min · Core</w:t>
+              <w:t>Your documents and the playground</w:t>
             </w:r>
           </w:p>
           <w:p>
@@ -475,7 +643,7 @@
               <w:rPr>
                 <w:sz w:val="20"/>
               </w:rPr>
-              <w:t>B1 · Why UX matters to the business · 18 min · Core</w:t>
+              <w:t>How we work</w:t>
             </w:r>
           </w:p>
           <w:p>
@@ -487,7 +655,7 @@
               <w:rPr>
                 <w:sz w:val="20"/>
               </w:rPr>
-              <w:t>B2 · Conflicting goals: user value, effort and business goals · 22 min · Core</w:t>
+              <w:t>A1 · UX is the experience, UI is the surface · 10 min · Core</w:t>
             </w:r>
           </w:p>
           <w:p>
@@ -499,12 +667,3426 @@
               <w:rPr>
                 <w:sz w:val="20"/>
               </w:rPr>
+              <w:t>A2 · Design from the learner's need, not from the system's logic · 12 min · Core</w:t>
+            </w:r>
+          </w:p>
+          <w:p>
+            <w:pPr>
+              <w:spacing w:before="0" w:after="20"/>
+              <w:ind w:left="170"/>
+            </w:pPr>
+            <w:r>
+              <w:rPr>
+                <w:sz w:val="20"/>
+              </w:rPr>
+              <w:t>A3 · Three principles of a good learning interface · 14 min · Core</w:t>
+            </w:r>
+          </w:p>
+          <w:p>
+            <w:pPr>
+              <w:spacing w:before="0" w:after="20"/>
+              <w:ind w:left="170"/>
+            </w:pPr>
+            <w:r>
+              <w:rPr>
+                <w:sz w:val="20"/>
+              </w:rPr>
+              <w:t>A4 · A learning platform is not a classic app · 10 min · Optional</w:t>
+            </w:r>
+          </w:p>
+          <w:p>
+            <w:pPr>
+              <w:spacing w:before="0" w:after="20"/>
+              <w:ind w:left="170"/>
+            </w:pPr>
+            <w:r>
+              <w:rPr>
+                <w:sz w:val="20"/>
+              </w:rPr>
+              <w:t>A5 · Weighing a measure: user impact, effort, risk · 14 min · Core</w:t>
+            </w:r>
+          </w:p>
+          <w:p>
+            <w:pPr>
+              <w:spacing w:before="0" w:after="20"/>
+              <w:ind w:left="170"/>
+            </w:pPr>
+            <w:r>
+              <w:rPr>
+                <w:sz w:val="20"/>
+              </w:rPr>
+              <w:t>B1 · Why UX matters to the business · 18 min · Core</w:t>
+            </w:r>
+          </w:p>
+          <w:p>
+            <w:pPr>
+              <w:spacing w:before="0" w:after="20"/>
+              <w:ind w:left="170"/>
+            </w:pPr>
+            <w:r>
+              <w:rPr>
+                <w:sz w:val="20"/>
+              </w:rPr>
+              <w:t>B2 · Conflicting goals: user value, effort and business goals · 22 min · Core</w:t>
+            </w:r>
+          </w:p>
+          <w:p>
+            <w:pPr>
+              <w:spacing w:before="0" w:after="20"/>
+              <w:ind w:left="170"/>
+            </w:pPr>
+            <w:r>
+              <w:rPr>
+                <w:sz w:val="20"/>
+              </w:rPr>
               <w:t>B3 · Deciding when you do not know enough · 20 min · Core</w:t>
             </w:r>
           </w:p>
         </w:tc>
       </w:tr>
     </w:tbl>
+    <w:p>
+      <w:pPr>
+        <w:pStyle w:val="Heading1"/>
+        <w:pBdr>
+          <w:bottom w:val="single" w:sz="8" w:space="2" w:color="17212E"/>
+        </w:pBdr>
+      </w:pPr>
+      <w:r>
+        <w:rPr/>
+        <w:t>Day at a glance</w:t>
+      </w:r>
+    </w:p>
+    <w:p>
+      <w:pPr>
+        <w:spacing w:before="0" w:after="100"/>
+      </w:pPr>
+      <w:r>
+        <w:rPr/>
+        <w:t xml:space="preserve">Day 1 has ten teaching units (UE). This document is the study material; it is used in UE1 (Materi A) and UE8 (Materi B). The day is built from three documents and the playground: </w:t>
+      </w:r>
+      <w:r>
+        <w:rPr>
+          <w:b/>
+        </w:rPr>
+        <w:t>Materi</w:t>
+      </w:r>
+      <w:r>
+        <w:rPr/>
+        <w:t xml:space="preserve"> (study material), </w:t>
+      </w:r>
+      <w:r>
+        <w:rPr>
+          <w:b/>
+        </w:rPr>
+        <w:t>Task</w:t>
+      </w:r>
+      <w:r>
+        <w:rPr/>
+        <w:t xml:space="preserve"> (worksheet) and </w:t>
+      </w:r>
+      <w:r>
+        <w:rPr>
+          <w:b/>
+        </w:rPr>
+        <w:t>Trainer</w:t>
+      </w:r>
+      <w:r>
+        <w:rPr/>
+        <w:t xml:space="preserve"> (coaching, feedback and model solutions), plus the course website.</w:t>
+      </w:r>
+    </w:p>
+    <w:p>
+      <w:pPr>
+        <w:pStyle w:val="Heading2"/>
+      </w:pPr>
+      <w:r>
+        <w:rPr/>
+        <w:t>Lesson plan: ten teaching units (Ablaufplan)</w:t>
+      </w:r>
+    </w:p>
+    <w:tbl>
+      <w:tblPr>
+        <w:tblW w:w="9638" w:type="dxa"/>
+        <w:tblBorders>
+          <w:top w:val="single" w:sz="4" w:space="0" w:color="D5DEE9"/>
+          <w:left w:val="single" w:sz="4" w:space="0" w:color="D5DEE9"/>
+          <w:bottom w:val="single" w:sz="4" w:space="0" w:color="D5DEE9"/>
+          <w:right w:val="single" w:sz="4" w:space="0" w:color="D5DEE9"/>
+          <w:insideH w:val="single" w:sz="4" w:space="0" w:color="D5DEE9"/>
+          <w:insideV w:val="single" w:sz="4" w:space="0" w:color="D5DEE9"/>
+        </w:tblBorders>
+        <w:tblLayout w:type="fixed"/>
+        <w:tblCellMar>
+          <w:top w:w="60" w:type="dxa"/>
+          <w:left w:w="100" w:type="dxa"/>
+          <w:bottom w:w="60" w:type="dxa"/>
+          <w:right w:w="100" w:type="dxa"/>
+        </w:tblCellMar>
+      </w:tblPr>
+      <w:tblGrid>
+        <w:gridCol w:w="597"/>
+        <w:gridCol w:w="597"/>
+        <w:gridCol w:w="1800"/>
+        <w:gridCol w:w="3292"/>
+        <w:gridCol w:w="1503"/>
+        <w:gridCol w:w="1849"/>
+      </w:tblGrid>
+      <w:tr>
+        <w:trPr>
+          <w:cantSplit/>
+          <w:tblHeader/>
+        </w:trPr>
+        <w:tc>
+          <w:tcPr>
+            <w:tcW w:type="dxa" w:w="597"/>
+            <w:shd w:val="clear" w:color="auto" w:fill="E6ECF4"/>
+          </w:tcPr>
+          <w:p>
+            <w:pPr>
+              <w:spacing w:before="0" w:after="0"/>
+            </w:pPr>
+            <w:r>
+              <w:rPr>
+                <w:b/>
+                <w:sz w:val="19"/>
+              </w:rPr>
+              <w:t>UE</w:t>
+            </w:r>
+          </w:p>
+        </w:tc>
+        <w:tc>
+          <w:tcPr>
+            <w:tcW w:type="dxa" w:w="597"/>
+            <w:shd w:val="clear" w:color="auto" w:fill="E6ECF4"/>
+          </w:tcPr>
+          <w:p>
+            <w:pPr>
+              <w:spacing w:before="0" w:after="0"/>
+            </w:pPr>
+            <w:r>
+              <w:rPr>
+                <w:b/>
+                <w:sz w:val="19"/>
+              </w:rPr>
+              <w:t>Min</w:t>
+            </w:r>
+          </w:p>
+        </w:tc>
+        <w:tc>
+          <w:tcPr>
+            <w:tcW w:type="dxa" w:w="1800"/>
+            <w:shd w:val="clear" w:color="auto" w:fill="E6ECF4"/>
+          </w:tcPr>
+          <w:p>
+            <w:pPr>
+              <w:spacing w:before="0" w:after="0"/>
+            </w:pPr>
+            <w:r>
+              <w:rPr>
+                <w:b/>
+                <w:sz w:val="19"/>
+              </w:rPr>
+              <w:t>Plan item</w:t>
+            </w:r>
+          </w:p>
+        </w:tc>
+        <w:tc>
+          <w:tcPr>
+            <w:tcW w:type="dxa" w:w="3292"/>
+            <w:shd w:val="clear" w:color="auto" w:fill="E6ECF4"/>
+          </w:tcPr>
+          <w:p>
+            <w:pPr>
+              <w:spacing w:before="0" w:after="0"/>
+            </w:pPr>
+            <w:r>
+              <w:rPr>
+                <w:b/>
+                <w:sz w:val="19"/>
+              </w:rPr>
+              <w:t>What happens</w:t>
+            </w:r>
+          </w:p>
+        </w:tc>
+        <w:tc>
+          <w:tcPr>
+            <w:tcW w:type="dxa" w:w="1503"/>
+            <w:shd w:val="clear" w:color="auto" w:fill="E6ECF4"/>
+          </w:tcPr>
+          <w:p>
+            <w:pPr>
+              <w:spacing w:before="0" w:after="0"/>
+            </w:pPr>
+            <w:r>
+              <w:rPr>
+                <w:b/>
+                <w:sz w:val="19"/>
+              </w:rPr>
+              <w:t>Material</w:t>
+            </w:r>
+          </w:p>
+        </w:tc>
+        <w:tc>
+          <w:tcPr>
+            <w:tcW w:type="dxa" w:w="1849"/>
+            <w:shd w:val="clear" w:color="auto" w:fill="E6ECF4"/>
+          </w:tcPr>
+          <w:p>
+            <w:pPr>
+              <w:spacing w:before="0" w:after="0"/>
+            </w:pPr>
+            <w:r>
+              <w:rPr>
+                <w:b/>
+                <w:sz w:val="19"/>
+              </w:rPr>
+              <w:t>Format</w:t>
+            </w:r>
+          </w:p>
+        </w:tc>
+      </w:tr>
+      <w:tr>
+        <w:trPr>
+          <w:cantSplit/>
+        </w:trPr>
+        <w:tc>
+          <w:tcPr>
+            <w:tcW w:type="dxa" w:w="597"/>
+          </w:tcPr>
+          <w:p>
+            <w:pPr>
+              <w:spacing w:before="0" w:after="0"/>
+            </w:pPr>
+            <w:r>
+              <w:rPr>
+                <w:b/>
+                <w:sz w:val="19"/>
+              </w:rPr>
+              <w:t>1</w:t>
+            </w:r>
+          </w:p>
+        </w:tc>
+        <w:tc>
+          <w:tcPr>
+            <w:tcW w:type="dxa" w:w="597"/>
+          </w:tcPr>
+          <w:p>
+            <w:pPr>
+              <w:spacing w:before="0" w:after="0"/>
+            </w:pPr>
+            <w:r>
+              <w:rPr>
+                <w:sz w:val="19"/>
+              </w:rPr>
+              <w:t>45</w:t>
+            </w:r>
+          </w:p>
+        </w:tc>
+        <w:tc>
+          <w:tcPr>
+            <w:tcW w:type="dxa" w:w="1800"/>
+          </w:tcPr>
+          <w:p>
+            <w:pPr>
+              <w:spacing w:before="0" w:after="0"/>
+            </w:pPr>
+            <w:r>
+              <w:rPr>
+                <w:sz w:val="19"/>
+              </w:rPr>
+              <w:t>Knowledge transfer · Level 1</w:t>
+            </w:r>
+          </w:p>
+        </w:tc>
+        <w:tc>
+          <w:tcPr>
+            <w:tcW w:type="dxa" w:w="3292"/>
+          </w:tcPr>
+          <w:p>
+            <w:pPr>
+              <w:spacing w:before="0" w:after="0"/>
+            </w:pPr>
+            <w:r>
+              <w:rPr>
+                <w:sz w:val="19"/>
+              </w:rPr>
+              <w:t>The trainer presents the Core cards of Materi A (A1, A2, A3, A5, about 50 min of cards) on the playground; participants follow in the handout. Optional A4 is read from the handout.</w:t>
+            </w:r>
+          </w:p>
+        </w:tc>
+        <w:tc>
+          <w:tcPr>
+            <w:tcW w:type="dxa" w:w="1503"/>
+          </w:tcPr>
+          <w:p>
+            <w:pPr>
+              <w:spacing w:before="0" w:after="0"/>
+            </w:pPr>
+            <w:r>
+              <w:rPr>
+                <w:sz w:val="19"/>
+              </w:rPr>
+              <w:t>Materi A (Route 1)</w:t>
+            </w:r>
+          </w:p>
+        </w:tc>
+        <w:tc>
+          <w:tcPr>
+            <w:tcW w:type="dxa" w:w="1849"/>
+          </w:tcPr>
+          <w:p>
+            <w:pPr>
+              <w:spacing w:before="0" w:after="0"/>
+            </w:pPr>
+            <w:r>
+              <w:rPr>
+                <w:sz w:val="19"/>
+              </w:rPr>
+              <w:t>Presentation + Handout</w:t>
+            </w:r>
+          </w:p>
+        </w:tc>
+      </w:tr>
+      <w:tr>
+        <w:trPr>
+          <w:cantSplit/>
+        </w:trPr>
+        <w:tc>
+          <w:tcPr>
+            <w:tcW w:type="dxa" w:w="597"/>
+          </w:tcPr>
+          <w:p>
+            <w:pPr>
+              <w:spacing w:before="0" w:after="0"/>
+            </w:pPr>
+            <w:r>
+              <w:rPr>
+                <w:b/>
+                <w:sz w:val="19"/>
+              </w:rPr>
+              <w:t>2</w:t>
+            </w:r>
+          </w:p>
+        </w:tc>
+        <w:tc>
+          <w:tcPr>
+            <w:tcW w:type="dxa" w:w="597"/>
+          </w:tcPr>
+          <w:p>
+            <w:pPr>
+              <w:spacing w:before="0" w:after="0"/>
+            </w:pPr>
+            <w:r>
+              <w:rPr>
+                <w:sz w:val="19"/>
+              </w:rPr>
+              <w:t>45</w:t>
+            </w:r>
+          </w:p>
+        </w:tc>
+        <w:tc>
+          <w:tcPr>
+            <w:tcW w:type="dxa" w:w="1800"/>
+          </w:tcPr>
+          <w:p>
+            <w:pPr>
+              <w:spacing w:before="0" w:after="0"/>
+            </w:pPr>
+            <w:r>
+              <w:rPr>
+                <w:sz w:val="19"/>
+              </w:rPr>
+              <w:t>Level 1 · Task 1</w:t>
+            </w:r>
+          </w:p>
+        </w:tc>
+        <w:tc>
+          <w:tcPr>
+            <w:tcW w:type="dxa" w:w="3292"/>
+          </w:tcPr>
+          <w:p>
+            <w:pPr>
+              <w:spacing w:before="0" w:after="0"/>
+            </w:pPr>
+            <w:r>
+              <w:rPr>
+                <w:sz w:val="19"/>
+              </w:rPr>
+              <w:t>Individual work on Block 1.1 (Core, about 13 min). Pairs then compare their results and the trainer collects open questions.</w:t>
+            </w:r>
+          </w:p>
+        </w:tc>
+        <w:tc>
+          <w:tcPr>
+            <w:tcW w:type="dxa" w:w="1503"/>
+          </w:tcPr>
+          <w:p>
+            <w:pPr>
+              <w:spacing w:before="0" w:after="0"/>
+            </w:pPr>
+            <w:r>
+              <w:rPr>
+                <w:sz w:val="19"/>
+              </w:rPr>
+              <w:t>Task 1 · Part 1 · Block 1.1</w:t>
+            </w:r>
+          </w:p>
+        </w:tc>
+        <w:tc>
+          <w:tcPr>
+            <w:tcW w:type="dxa" w:w="1849"/>
+          </w:tcPr>
+          <w:p>
+            <w:pPr>
+              <w:spacing w:before="0" w:after="0"/>
+            </w:pPr>
+            <w:r>
+              <w:rPr>
+                <w:sz w:val="19"/>
+              </w:rPr>
+              <w:t>Handout (or on the playground)</w:t>
+            </w:r>
+          </w:p>
+        </w:tc>
+      </w:tr>
+      <w:tr>
+        <w:trPr>
+          <w:cantSplit/>
+        </w:trPr>
+        <w:tc>
+          <w:tcPr>
+            <w:tcW w:type="dxa" w:w="597"/>
+          </w:tcPr>
+          <w:p>
+            <w:pPr>
+              <w:spacing w:before="0" w:after="0"/>
+            </w:pPr>
+            <w:r>
+              <w:rPr>
+                <w:b/>
+                <w:sz w:val="19"/>
+              </w:rPr>
+              <w:t>3</w:t>
+            </w:r>
+          </w:p>
+        </w:tc>
+        <w:tc>
+          <w:tcPr>
+            <w:tcW w:type="dxa" w:w="597"/>
+          </w:tcPr>
+          <w:p>
+            <w:pPr>
+              <w:spacing w:before="0" w:after="0"/>
+            </w:pPr>
+            <w:r>
+              <w:rPr>
+                <w:sz w:val="19"/>
+              </w:rPr>
+              <w:t>45</w:t>
+            </w:r>
+          </w:p>
+        </w:tc>
+        <w:tc>
+          <w:tcPr>
+            <w:tcW w:type="dxa" w:w="1800"/>
+          </w:tcPr>
+          <w:p>
+            <w:pPr>
+              <w:spacing w:before="0" w:after="0"/>
+            </w:pPr>
+            <w:r>
+              <w:rPr>
+                <w:sz w:val="19"/>
+              </w:rPr>
+              <w:t>Level 1 · Task 2</w:t>
+            </w:r>
+          </w:p>
+        </w:tc>
+        <w:tc>
+          <w:tcPr>
+            <w:tcW w:type="dxa" w:w="3292"/>
+          </w:tcPr>
+          <w:p>
+            <w:pPr>
+              <w:spacing w:before="0" w:after="0"/>
+            </w:pPr>
+            <w:r>
+              <w:rPr>
+                <w:sz w:val="19"/>
+              </w:rPr>
+              <w:t>Participants rate the three measures on user impact, effort and risk and say what information is missing: the first part of Block 2.2 (Core, about 17 min). The block is finished in UE5–6.</w:t>
+            </w:r>
+          </w:p>
+        </w:tc>
+        <w:tc>
+          <w:tcPr>
+            <w:tcW w:type="dxa" w:w="1503"/>
+          </w:tcPr>
+          <w:p>
+            <w:pPr>
+              <w:spacing w:before="0" w:after="0"/>
+            </w:pPr>
+            <w:r>
+              <w:rPr>
+                <w:sz w:val="19"/>
+              </w:rPr>
+              <w:t>Task 1 · Part 2 · Block 2.2</w:t>
+            </w:r>
+          </w:p>
+        </w:tc>
+        <w:tc>
+          <w:tcPr>
+            <w:tcW w:type="dxa" w:w="1849"/>
+          </w:tcPr>
+          <w:p>
+            <w:pPr>
+              <w:spacing w:before="0" w:after="0"/>
+            </w:pPr>
+            <w:r>
+              <w:rPr>
+                <w:sz w:val="19"/>
+              </w:rPr>
+              <w:t>Handout (or on the playground)</w:t>
+            </w:r>
+          </w:p>
+        </w:tc>
+      </w:tr>
+      <w:tr>
+        <w:trPr>
+          <w:cantSplit/>
+        </w:trPr>
+        <w:tc>
+          <w:tcPr>
+            <w:tcW w:type="dxa" w:w="597"/>
+          </w:tcPr>
+          <w:p>
+            <w:pPr>
+              <w:spacing w:before="0" w:after="0"/>
+            </w:pPr>
+            <w:r>
+              <w:rPr>
+                <w:b/>
+                <w:sz w:val="19"/>
+              </w:rPr>
+              <w:t>4</w:t>
+            </w:r>
+          </w:p>
+        </w:tc>
+        <w:tc>
+          <w:tcPr>
+            <w:tcW w:type="dxa" w:w="597"/>
+          </w:tcPr>
+          <w:p>
+            <w:pPr>
+              <w:spacing w:before="0" w:after="0"/>
+            </w:pPr>
+            <w:r>
+              <w:rPr>
+                <w:sz w:val="19"/>
+              </w:rPr>
+              <w:t>45</w:t>
+            </w:r>
+          </w:p>
+        </w:tc>
+        <w:tc>
+          <w:tcPr>
+            <w:tcW w:type="dxa" w:w="1800"/>
+          </w:tcPr>
+          <w:p>
+            <w:pPr>
+              <w:spacing w:before="0" w:after="0"/>
+            </w:pPr>
+            <w:r>
+              <w:rPr>
+                <w:sz w:val="19"/>
+              </w:rPr>
+              <w:t>Coaching · transition from Level 1 to Level 2</w:t>
+            </w:r>
+          </w:p>
+        </w:tc>
+        <w:tc>
+          <w:tcPr>
+            <w:tcW w:type="dxa" w:w="3292"/>
+          </w:tcPr>
+          <w:p>
+            <w:pPr>
+              <w:spacing w:before="0" w:after="0"/>
+            </w:pPr>
+            <w:r>
+              <w:rPr>
+                <w:sz w:val="19"/>
+              </w:rPr>
+              <w:t>Trainer-led. A short talk on the day's coaching focus, then the reflection questions in pairs: Block 1.3 (Optional, about 5 min). The bridge: from reading an interface to deciding under limits.</w:t>
+            </w:r>
+          </w:p>
+        </w:tc>
+        <w:tc>
+          <w:tcPr>
+            <w:tcW w:type="dxa" w:w="1503"/>
+          </w:tcPr>
+          <w:p>
+            <w:pPr>
+              <w:spacing w:before="0" w:after="0"/>
+            </w:pPr>
+            <w:r>
+              <w:rPr>
+                <w:sz w:val="19"/>
+              </w:rPr>
+              <w:t>Task 1 · Block 1.3</w:t>
+            </w:r>
+            <w:r>
+              <w:br/>
+            </w:r>
+            <w:r>
+              <w:rPr>
+                <w:sz w:val="19"/>
+              </w:rPr>
+              <w:t>Trainer document, section Coaching</w:t>
+            </w:r>
+          </w:p>
+        </w:tc>
+        <w:tc>
+          <w:tcPr>
+            <w:tcW w:type="dxa" w:w="1849"/>
+          </w:tcPr>
+          <w:p>
+            <w:pPr>
+              <w:spacing w:before="0" w:after="0"/>
+            </w:pPr>
+            <w:r>
+              <w:rPr>
+                <w:sz w:val="19"/>
+              </w:rPr>
+              <w:t>Trainer only + Handout</w:t>
+            </w:r>
+          </w:p>
+        </w:tc>
+      </w:tr>
+      <w:tr>
+        <w:trPr>
+          <w:cantSplit/>
+        </w:trPr>
+        <w:tc>
+          <w:tcPr>
+            <w:tcW w:type="dxa" w:w="597"/>
+          </w:tcPr>
+          <w:p>
+            <w:pPr>
+              <w:spacing w:before="0" w:after="0"/>
+            </w:pPr>
+            <w:r>
+              <w:rPr>
+                <w:b/>
+                <w:sz w:val="19"/>
+              </w:rPr>
+              <w:t>5–6</w:t>
+            </w:r>
+          </w:p>
+        </w:tc>
+        <w:tc>
+          <w:tcPr>
+            <w:tcW w:type="dxa" w:w="597"/>
+          </w:tcPr>
+          <w:p>
+            <w:pPr>
+              <w:spacing w:before="0" w:after="0"/>
+            </w:pPr>
+            <w:r>
+              <w:rPr>
+                <w:sz w:val="19"/>
+              </w:rPr>
+              <w:t>90</w:t>
+            </w:r>
+          </w:p>
+        </w:tc>
+        <w:tc>
+          <w:tcPr>
+            <w:tcW w:type="dxa" w:w="1800"/>
+          </w:tcPr>
+          <w:p>
+            <w:pPr>
+              <w:spacing w:before="0" w:after="0"/>
+            </w:pPr>
+            <w:r>
+              <w:rPr>
+                <w:sz w:val="19"/>
+              </w:rPr>
+              <w:t>Level 2 · Case study SkillUp (</w:t>
+            </w:r>
+            <w:r>
+              <w:rPr>
+                <w:b/>
+                <w:sz w:val="19"/>
+              </w:rPr>
+              <w:t>2 UE</w:t>
+            </w:r>
+            <w:r>
+              <w:rPr>
+                <w:sz w:val="19"/>
+              </w:rPr>
+              <w:t>) incl. model solution</w:t>
+            </w:r>
+          </w:p>
+        </w:tc>
+        <w:tc>
+          <w:tcPr>
+            <w:tcW w:type="dxa" w:w="3292"/>
+          </w:tcPr>
+          <w:p>
+            <w:pPr>
+              <w:spacing w:before="0" w:after="0"/>
+            </w:pPr>
+            <w:r>
+              <w:rPr>
+                <w:sz w:val="19"/>
+              </w:rPr>
+              <w:t>UE5: the trainer presents the case; participants work on Block 2.1 (Optional, about 7 min) and Block 2.2 (Core, about 17 min). UE6: groups compare their order and defend it; the trainer closes with the model solution (core logic).</w:t>
+            </w:r>
+          </w:p>
+        </w:tc>
+        <w:tc>
+          <w:tcPr>
+            <w:tcW w:type="dxa" w:w="1503"/>
+          </w:tcPr>
+          <w:p>
+            <w:pPr>
+              <w:spacing w:before="0" w:after="0"/>
+            </w:pPr>
+            <w:r>
+              <w:rPr>
+                <w:sz w:val="19"/>
+              </w:rPr>
+              <w:t>Task 1 · Part 2 · Blocks 2.1, 2.2</w:t>
+            </w:r>
+            <w:r>
+              <w:br/>
+            </w:r>
+            <w:r>
+              <w:rPr>
+                <w:sz w:val="19"/>
+              </w:rPr>
+              <w:t>Trainer document, section Case study</w:t>
+            </w:r>
+          </w:p>
+        </w:tc>
+        <w:tc>
+          <w:tcPr>
+            <w:tcW w:type="dxa" w:w="1849"/>
+          </w:tcPr>
+          <w:p>
+            <w:pPr>
+              <w:spacing w:before="0" w:after="0"/>
+            </w:pPr>
+            <w:r>
+              <w:rPr>
+                <w:sz w:val="19"/>
+              </w:rPr>
+              <w:t>Handout; model solution shown after the work</w:t>
+            </w:r>
+          </w:p>
+        </w:tc>
+      </w:tr>
+      <w:tr>
+        <w:trPr>
+          <w:cantSplit/>
+        </w:trPr>
+        <w:tc>
+          <w:tcPr>
+            <w:tcW w:type="dxa" w:w="597"/>
+          </w:tcPr>
+          <w:p>
+            <w:pPr>
+              <w:spacing w:before="0" w:after="0"/>
+            </w:pPr>
+            <w:r>
+              <w:rPr>
+                <w:b/>
+                <w:sz w:val="19"/>
+              </w:rPr>
+              <w:t>7</w:t>
+            </w:r>
+          </w:p>
+        </w:tc>
+        <w:tc>
+          <w:tcPr>
+            <w:tcW w:type="dxa" w:w="597"/>
+          </w:tcPr>
+          <w:p>
+            <w:pPr>
+              <w:spacing w:before="0" w:after="0"/>
+            </w:pPr>
+            <w:r>
+              <w:rPr>
+                <w:sz w:val="19"/>
+              </w:rPr>
+              <w:t>45</w:t>
+            </w:r>
+          </w:p>
+        </w:tc>
+        <w:tc>
+          <w:tcPr>
+            <w:tcW w:type="dxa" w:w="1800"/>
+          </w:tcPr>
+          <w:p>
+            <w:pPr>
+              <w:spacing w:before="0" w:after="0"/>
+            </w:pPr>
+            <w:r>
+              <w:rPr>
+                <w:sz w:val="19"/>
+              </w:rPr>
+              <w:t>Level 2 + 3 · Feedback round with a management perspective</w:t>
+            </w:r>
+          </w:p>
+        </w:tc>
+        <w:tc>
+          <w:tcPr>
+            <w:tcW w:type="dxa" w:w="3292"/>
+          </w:tcPr>
+          <w:p>
+            <w:pPr>
+              <w:spacing w:before="0" w:after="0"/>
+            </w:pPr>
+            <w:r>
+              <w:rPr>
+                <w:sz w:val="19"/>
+              </w:rPr>
+              <w:t>Groups present their reasoning, not only their result. The trainer asks the day's Level 3 input questions and leads the discussion.</w:t>
+            </w:r>
+          </w:p>
+        </w:tc>
+        <w:tc>
+          <w:tcPr>
+            <w:tcW w:type="dxa" w:w="1503"/>
+          </w:tcPr>
+          <w:p>
+            <w:pPr>
+              <w:spacing w:before="0" w:after="0"/>
+            </w:pPr>
+            <w:r>
+              <w:rPr>
+                <w:sz w:val="19"/>
+              </w:rPr>
+              <w:t>Trainer document, section Feedback round</w:t>
+            </w:r>
+          </w:p>
+        </w:tc>
+        <w:tc>
+          <w:tcPr>
+            <w:tcW w:type="dxa" w:w="1849"/>
+          </w:tcPr>
+          <w:p>
+            <w:pPr>
+              <w:spacing w:before="0" w:after="0"/>
+            </w:pPr>
+            <w:r>
+              <w:rPr>
+                <w:sz w:val="19"/>
+              </w:rPr>
+              <w:t>Presentation by the groups; Trainer only</w:t>
+            </w:r>
+          </w:p>
+        </w:tc>
+      </w:tr>
+      <w:tr>
+        <w:trPr>
+          <w:cantSplit/>
+        </w:trPr>
+        <w:tc>
+          <w:tcPr>
+            <w:tcW w:type="dxa" w:w="597"/>
+          </w:tcPr>
+          <w:p>
+            <w:pPr>
+              <w:spacing w:before="0" w:after="0"/>
+            </w:pPr>
+            <w:r>
+              <w:rPr>
+                <w:b/>
+                <w:sz w:val="19"/>
+              </w:rPr>
+              <w:t>8</w:t>
+            </w:r>
+          </w:p>
+        </w:tc>
+        <w:tc>
+          <w:tcPr>
+            <w:tcW w:type="dxa" w:w="597"/>
+          </w:tcPr>
+          <w:p>
+            <w:pPr>
+              <w:spacing w:before="0" w:after="0"/>
+            </w:pPr>
+            <w:r>
+              <w:rPr>
+                <w:sz w:val="19"/>
+              </w:rPr>
+              <w:t>45</w:t>
+            </w:r>
+          </w:p>
+        </w:tc>
+        <w:tc>
+          <w:tcPr>
+            <w:tcW w:type="dxa" w:w="1800"/>
+          </w:tcPr>
+          <w:p>
+            <w:pPr>
+              <w:spacing w:before="0" w:after="0"/>
+            </w:pPr>
+            <w:r>
+              <w:rPr>
+                <w:sz w:val="19"/>
+              </w:rPr>
+              <w:t>Level 3 · Transfer project, Chief UX Officer (</w:t>
+            </w:r>
+            <w:r>
+              <w:rPr>
+                <w:b/>
+                <w:sz w:val="19"/>
+              </w:rPr>
+              <w:t>3 UE</w:t>
+            </w:r>
+            <w:r>
+              <w:rPr>
+                <w:sz w:val="19"/>
+              </w:rPr>
+              <w:t>: UE8–10)</w:t>
+            </w:r>
+          </w:p>
+        </w:tc>
+        <w:tc>
+          <w:tcPr>
+            <w:tcW w:type="dxa" w:w="3292"/>
+          </w:tcPr>
+          <w:p>
+            <w:pPr>
+              <w:spacing w:before="0" w:after="0"/>
+            </w:pPr>
+            <w:r>
+              <w:rPr>
+                <w:sz w:val="19"/>
+              </w:rPr>
+              <w:t>The trainer presents Materi B (B1, B2, B3; use the "In plain words" and "How to decide" boxes, the rest is handout) and sets the role and the brief.</w:t>
+            </w:r>
+          </w:p>
+        </w:tc>
+        <w:tc>
+          <w:tcPr>
+            <w:tcW w:type="dxa" w:w="1503"/>
+          </w:tcPr>
+          <w:p>
+            <w:pPr>
+              <w:spacing w:before="0" w:after="0"/>
+            </w:pPr>
+            <w:r>
+              <w:rPr>
+                <w:sz w:val="19"/>
+              </w:rPr>
+              <w:t>Materi B (Route 2)</w:t>
+            </w:r>
+          </w:p>
+        </w:tc>
+        <w:tc>
+          <w:tcPr>
+            <w:tcW w:type="dxa" w:w="1849"/>
+          </w:tcPr>
+          <w:p>
+            <w:pPr>
+              <w:spacing w:before="0" w:after="0"/>
+            </w:pPr>
+            <w:r>
+              <w:rPr>
+                <w:sz w:val="19"/>
+              </w:rPr>
+              <w:t>Presentation + Handout</w:t>
+            </w:r>
+          </w:p>
+        </w:tc>
+      </w:tr>
+      <w:tr>
+        <w:trPr>
+          <w:cantSplit/>
+        </w:trPr>
+        <w:tc>
+          <w:tcPr>
+            <w:tcW w:type="dxa" w:w="597"/>
+          </w:tcPr>
+          <w:p>
+            <w:pPr>
+              <w:spacing w:before="0" w:after="0"/>
+            </w:pPr>
+            <w:r>
+              <w:rPr>
+                <w:b/>
+                <w:sz w:val="19"/>
+              </w:rPr>
+              <w:t>9</w:t>
+            </w:r>
+          </w:p>
+        </w:tc>
+        <w:tc>
+          <w:tcPr>
+            <w:tcW w:type="dxa" w:w="597"/>
+          </w:tcPr>
+          <w:p>
+            <w:pPr>
+              <w:spacing w:before="0" w:after="0"/>
+            </w:pPr>
+            <w:r>
+              <w:rPr>
+                <w:sz w:val="19"/>
+              </w:rPr>
+              <w:t>45</w:t>
+            </w:r>
+          </w:p>
+        </w:tc>
+        <w:tc>
+          <w:tcPr>
+            <w:tcW w:type="dxa" w:w="1800"/>
+          </w:tcPr>
+          <w:p>
+            <w:pPr>
+              <w:spacing w:before="0" w:after="0"/>
+            </w:pPr>
+            <w:r>
+              <w:rPr>
+                <w:sz w:val="19"/>
+              </w:rPr>
+              <w:t>Level 3 · Transfer project</w:t>
+            </w:r>
+          </w:p>
+        </w:tc>
+        <w:tc>
+          <w:tcPr>
+            <w:tcW w:type="dxa" w:w="3292"/>
+          </w:tcPr>
+          <w:p>
+            <w:pPr>
+              <w:spacing w:before="0" w:after="0"/>
+            </w:pPr>
+            <w:r>
+              <w:rPr>
+                <w:sz w:val="19"/>
+              </w:rPr>
+              <w:t>Individual work or in pairs on Block 3.1 (Core, about 9 min).</w:t>
+            </w:r>
+          </w:p>
+        </w:tc>
+        <w:tc>
+          <w:tcPr>
+            <w:tcW w:type="dxa" w:w="1503"/>
+          </w:tcPr>
+          <w:p>
+            <w:pPr>
+              <w:spacing w:before="0" w:after="0"/>
+            </w:pPr>
+            <w:r>
+              <w:rPr>
+                <w:sz w:val="19"/>
+              </w:rPr>
+              <w:t>Task 2 · Block 3.1</w:t>
+            </w:r>
+          </w:p>
+        </w:tc>
+        <w:tc>
+          <w:tcPr>
+            <w:tcW w:type="dxa" w:w="1849"/>
+          </w:tcPr>
+          <w:p>
+            <w:pPr>
+              <w:spacing w:before="0" w:after="0"/>
+            </w:pPr>
+            <w:r>
+              <w:rPr>
+                <w:sz w:val="19"/>
+              </w:rPr>
+              <w:t>Handout (or on the playground)</w:t>
+            </w:r>
+          </w:p>
+        </w:tc>
+      </w:tr>
+      <w:tr>
+        <w:trPr>
+          <w:cantSplit/>
+        </w:trPr>
+        <w:tc>
+          <w:tcPr>
+            <w:tcW w:type="dxa" w:w="597"/>
+          </w:tcPr>
+          <w:p>
+            <w:pPr>
+              <w:spacing w:before="0" w:after="0"/>
+            </w:pPr>
+            <w:r>
+              <w:rPr>
+                <w:b/>
+                <w:sz w:val="19"/>
+              </w:rPr>
+              <w:t>10</w:t>
+            </w:r>
+          </w:p>
+        </w:tc>
+        <w:tc>
+          <w:tcPr>
+            <w:tcW w:type="dxa" w:w="597"/>
+          </w:tcPr>
+          <w:p>
+            <w:pPr>
+              <w:spacing w:before="0" w:after="0"/>
+            </w:pPr>
+            <w:r>
+              <w:rPr>
+                <w:sz w:val="19"/>
+              </w:rPr>
+              <w:t>45</w:t>
+            </w:r>
+          </w:p>
+        </w:tc>
+        <w:tc>
+          <w:tcPr>
+            <w:tcW w:type="dxa" w:w="1800"/>
+          </w:tcPr>
+          <w:p>
+            <w:pPr>
+              <w:spacing w:before="0" w:after="0"/>
+            </w:pPr>
+            <w:r>
+              <w:rPr>
+                <w:sz w:val="19"/>
+              </w:rPr>
+              <w:t>Level 3 · Transfer project</w:t>
+            </w:r>
+          </w:p>
+        </w:tc>
+        <w:tc>
+          <w:tcPr>
+            <w:tcW w:type="dxa" w:w="3292"/>
+          </w:tcPr>
+          <w:p>
+            <w:pPr>
+              <w:spacing w:before="0" w:after="0"/>
+            </w:pPr>
+            <w:r>
+              <w:rPr>
+                <w:sz w:val="19"/>
+              </w:rPr>
+              <w:t>Block 3.2 (Core, about 11 min): the decision despite incomplete data. Participants then present the decision and what they give up; the trainer debriefs with the model solution.</w:t>
+            </w:r>
+          </w:p>
+        </w:tc>
+        <w:tc>
+          <w:tcPr>
+            <w:tcW w:type="dxa" w:w="1503"/>
+          </w:tcPr>
+          <w:p>
+            <w:pPr>
+              <w:spacing w:before="0" w:after="0"/>
+            </w:pPr>
+            <w:r>
+              <w:rPr>
+                <w:sz w:val="19"/>
+              </w:rPr>
+              <w:t>Task 2 · Block 3.2</w:t>
+            </w:r>
+            <w:r>
+              <w:br/>
+            </w:r>
+            <w:r>
+              <w:rPr>
+                <w:sz w:val="19"/>
+              </w:rPr>
+              <w:t>Trainer document, section Transfer project</w:t>
+            </w:r>
+          </w:p>
+        </w:tc>
+        <w:tc>
+          <w:tcPr>
+            <w:tcW w:type="dxa" w:w="1849"/>
+          </w:tcPr>
+          <w:p>
+            <w:pPr>
+              <w:spacing w:before="0" w:after="0"/>
+            </w:pPr>
+            <w:r>
+              <w:rPr>
+                <w:sz w:val="19"/>
+              </w:rPr>
+              <w:t>Handout; model solution shown after the work</w:t>
+            </w:r>
+          </w:p>
+        </w:tc>
+      </w:tr>
+    </w:tbl>
+    <w:p>
+      <w:pPr>
+        <w:spacing w:before="0" w:after="80"/>
+      </w:pPr>
+    </w:p>
+    <w:p>
+      <w:pPr>
+        <w:spacing w:before="0" w:after="100"/>
+      </w:pPr>
+      <w:r>
+        <w:rPr/>
+        <w:t>One UE is counted as 45 minutes here; breaks are not shown. The times are a guide for the trainer. Optional blocks and cards can be skipped; the Core blocks are enough for a complete answer.</w:t>
+      </w:r>
+    </w:p>
+    <w:p>
+      <w:pPr>
+        <w:pStyle w:val="Heading2"/>
+      </w:pPr>
+      <w:r>
+        <w:rPr/>
+        <w:t>Case study and transfer project at a glance</w:t>
+      </w:r>
+    </w:p>
+    <w:tbl>
+      <w:tblPr>
+        <w:tblW w:w="9638" w:type="dxa"/>
+        <w:tblBorders>
+          <w:top w:val="single" w:sz="4" w:space="0" w:color="D5DEE9"/>
+          <w:left w:val="single" w:sz="4" w:space="0" w:color="D5DEE9"/>
+          <w:bottom w:val="single" w:sz="4" w:space="0" w:color="D5DEE9"/>
+          <w:right w:val="single" w:sz="4" w:space="0" w:color="D5DEE9"/>
+          <w:insideH w:val="single" w:sz="4" w:space="0" w:color="D5DEE9"/>
+          <w:insideV w:val="single" w:sz="4" w:space="0" w:color="D5DEE9"/>
+        </w:tblBorders>
+        <w:tblLayout w:type="fixed"/>
+        <w:tblCellMar>
+          <w:top w:w="60" w:type="dxa"/>
+          <w:left w:w="100" w:type="dxa"/>
+          <w:bottom w:w="60" w:type="dxa"/>
+          <w:right w:w="100" w:type="dxa"/>
+        </w:tblCellMar>
+      </w:tblPr>
+      <w:tblGrid>
+        <w:gridCol w:w="2242"/>
+        <w:gridCol w:w="1029"/>
+        <w:gridCol w:w="1477"/>
+        <w:gridCol w:w="2539"/>
+        <w:gridCol w:w="2351"/>
+      </w:tblGrid>
+      <w:tr>
+        <w:trPr>
+          <w:cantSplit/>
+          <w:tblHeader/>
+        </w:trPr>
+        <w:tc>
+          <w:tcPr>
+            <w:tcW w:type="dxa" w:w="2242"/>
+            <w:shd w:val="clear" w:color="auto" w:fill="E6ECF4"/>
+          </w:tcPr>
+          <w:p>
+            <w:pPr>
+              <w:spacing w:before="0" w:after="0"/>
+            </w:pPr>
+            <w:r>
+              <w:rPr>
+                <w:b/>
+                <w:sz w:val="19"/>
+              </w:rPr>
+              <w:t>Component</w:t>
+            </w:r>
+          </w:p>
+        </w:tc>
+        <w:tc>
+          <w:tcPr>
+            <w:tcW w:type="dxa" w:w="1029"/>
+            <w:shd w:val="clear" w:color="auto" w:fill="E6ECF4"/>
+          </w:tcPr>
+          <w:p>
+            <w:pPr>
+              <w:spacing w:before="0" w:after="0"/>
+            </w:pPr>
+            <w:r>
+              <w:rPr>
+                <w:b/>
+                <w:sz w:val="19"/>
+              </w:rPr>
+              <w:t>UE</w:t>
+            </w:r>
+          </w:p>
+        </w:tc>
+        <w:tc>
+          <w:tcPr>
+            <w:tcW w:type="dxa" w:w="1477"/>
+            <w:shd w:val="clear" w:color="auto" w:fill="E6ECF4"/>
+          </w:tcPr>
+          <w:p>
+            <w:pPr>
+              <w:spacing w:before="0" w:after="0"/>
+            </w:pPr>
+            <w:r>
+              <w:rPr>
+                <w:b/>
+                <w:sz w:val="19"/>
+              </w:rPr>
+              <w:t>Duration</w:t>
+            </w:r>
+          </w:p>
+        </w:tc>
+        <w:tc>
+          <w:tcPr>
+            <w:tcW w:type="dxa" w:w="2539"/>
+            <w:shd w:val="clear" w:color="auto" w:fill="E6ECF4"/>
+          </w:tcPr>
+          <w:p>
+            <w:pPr>
+              <w:spacing w:before="0" w:after="0"/>
+            </w:pPr>
+            <w:r>
+              <w:rPr>
+                <w:b/>
+                <w:sz w:val="19"/>
+              </w:rPr>
+              <w:t>Participants work in</w:t>
+            </w:r>
+          </w:p>
+        </w:tc>
+        <w:tc>
+          <w:tcPr>
+            <w:tcW w:type="dxa" w:w="2351"/>
+            <w:shd w:val="clear" w:color="auto" w:fill="E6ECF4"/>
+          </w:tcPr>
+          <w:p>
+            <w:pPr>
+              <w:spacing w:before="0" w:after="0"/>
+            </w:pPr>
+            <w:r>
+              <w:rPr>
+                <w:b/>
+                <w:sz w:val="19"/>
+              </w:rPr>
+              <w:t>Model solution in</w:t>
+            </w:r>
+          </w:p>
+        </w:tc>
+      </w:tr>
+      <w:tr>
+        <w:trPr>
+          <w:cantSplit/>
+        </w:trPr>
+        <w:tc>
+          <w:tcPr>
+            <w:tcW w:type="dxa" w:w="2242"/>
+          </w:tcPr>
+          <w:p>
+            <w:pPr>
+              <w:spacing w:before="0" w:after="0"/>
+            </w:pPr>
+            <w:r>
+              <w:rPr>
+                <w:b/>
+                <w:sz w:val="19"/>
+              </w:rPr>
+              <w:t>Level 2 case study</w:t>
+            </w:r>
+            <w:r>
+              <w:rPr>
+                <w:sz w:val="19"/>
+              </w:rPr>
+              <w:t xml:space="preserve"> (SkillUp)</w:t>
+            </w:r>
+          </w:p>
+        </w:tc>
+        <w:tc>
+          <w:tcPr>
+            <w:tcW w:type="dxa" w:w="1029"/>
+          </w:tcPr>
+          <w:p>
+            <w:pPr>
+              <w:spacing w:before="0" w:after="0"/>
+            </w:pPr>
+            <w:r>
+              <w:rPr>
+                <w:sz w:val="19"/>
+              </w:rPr>
+              <w:t>UE5–6</w:t>
+            </w:r>
+          </w:p>
+        </w:tc>
+        <w:tc>
+          <w:tcPr>
+            <w:tcW w:type="dxa" w:w="1477"/>
+          </w:tcPr>
+          <w:p>
+            <w:pPr>
+              <w:spacing w:before="0" w:after="0"/>
+            </w:pPr>
+            <w:r>
+              <w:rPr>
+                <w:b/>
+                <w:sz w:val="19"/>
+              </w:rPr>
+              <w:t>2 UE</w:t>
+            </w:r>
+            <w:r>
+              <w:rPr>
+                <w:sz w:val="19"/>
+              </w:rPr>
+              <w:t xml:space="preserve"> · 90 min</w:t>
+            </w:r>
+          </w:p>
+        </w:tc>
+        <w:tc>
+          <w:tcPr>
+            <w:tcW w:type="dxa" w:w="2539"/>
+          </w:tcPr>
+          <w:p>
+            <w:pPr>
+              <w:spacing w:before="0" w:after="0"/>
+            </w:pPr>
+            <w:r>
+              <w:rPr>
+                <w:sz w:val="19"/>
+              </w:rPr>
+              <w:t>Task 1 · Part 2 (Blocks 2.1, 2.2)</w:t>
+            </w:r>
+          </w:p>
+        </w:tc>
+        <w:tc>
+          <w:tcPr>
+            <w:tcW w:type="dxa" w:w="2351"/>
+          </w:tcPr>
+          <w:p>
+            <w:pPr>
+              <w:spacing w:before="0" w:after="0"/>
+            </w:pPr>
+            <w:r>
+              <w:rPr>
+                <w:sz w:val="19"/>
+              </w:rPr>
+              <w:t>Trainer document, section Case study</w:t>
+            </w:r>
+          </w:p>
+        </w:tc>
+      </w:tr>
+      <w:tr>
+        <w:trPr>
+          <w:cantSplit/>
+        </w:trPr>
+        <w:tc>
+          <w:tcPr>
+            <w:tcW w:type="dxa" w:w="2242"/>
+          </w:tcPr>
+          <w:p>
+            <w:pPr>
+              <w:spacing w:before="0" w:after="0"/>
+            </w:pPr>
+            <w:r>
+              <w:rPr>
+                <w:b/>
+                <w:sz w:val="19"/>
+              </w:rPr>
+              <w:t>Level 3 transfer project</w:t>
+            </w:r>
+            <w:r>
+              <w:rPr>
+                <w:sz w:val="19"/>
+              </w:rPr>
+              <w:t xml:space="preserve"> (Chief UX Officer)</w:t>
+            </w:r>
+          </w:p>
+        </w:tc>
+        <w:tc>
+          <w:tcPr>
+            <w:tcW w:type="dxa" w:w="1029"/>
+          </w:tcPr>
+          <w:p>
+            <w:pPr>
+              <w:spacing w:before="0" w:after="0"/>
+            </w:pPr>
+            <w:r>
+              <w:rPr>
+                <w:sz w:val="19"/>
+              </w:rPr>
+              <w:t>UE8–10</w:t>
+            </w:r>
+          </w:p>
+        </w:tc>
+        <w:tc>
+          <w:tcPr>
+            <w:tcW w:type="dxa" w:w="1477"/>
+          </w:tcPr>
+          <w:p>
+            <w:pPr>
+              <w:spacing w:before="0" w:after="0"/>
+            </w:pPr>
+            <w:r>
+              <w:rPr>
+                <w:b/>
+                <w:sz w:val="19"/>
+              </w:rPr>
+              <w:t>3 UE</w:t>
+            </w:r>
+            <w:r>
+              <w:rPr>
+                <w:sz w:val="19"/>
+              </w:rPr>
+              <w:t xml:space="preserve"> · 135 min</w:t>
+            </w:r>
+          </w:p>
+        </w:tc>
+        <w:tc>
+          <w:tcPr>
+            <w:tcW w:type="dxa" w:w="2539"/>
+          </w:tcPr>
+          <w:p>
+            <w:pPr>
+              <w:spacing w:before="0" w:after="0"/>
+            </w:pPr>
+            <w:r>
+              <w:rPr>
+                <w:sz w:val="19"/>
+              </w:rPr>
+              <w:t>Materi B and Task 2 (Blocks 3.1, 3.2)</w:t>
+            </w:r>
+          </w:p>
+        </w:tc>
+        <w:tc>
+          <w:tcPr>
+            <w:tcW w:type="dxa" w:w="2351"/>
+          </w:tcPr>
+          <w:p>
+            <w:pPr>
+              <w:spacing w:before="0" w:after="0"/>
+            </w:pPr>
+            <w:r>
+              <w:rPr>
+                <w:sz w:val="19"/>
+              </w:rPr>
+              <w:t>Trainer document, section Transfer project</w:t>
+            </w:r>
+          </w:p>
+        </w:tc>
+      </w:tr>
+    </w:tbl>
+    <w:p>
+      <w:pPr>
+        <w:spacing w:before="0" w:after="80"/>
+      </w:pPr>
+    </w:p>
+    <w:p>
+      <w:pPr>
+        <w:pStyle w:val="Heading1"/>
+        <w:pBdr>
+          <w:bottom w:val="single" w:sz="8" w:space="2" w:color="17212E"/>
+        </w:pBdr>
+      </w:pPr>
+      <w:r>
+        <w:rPr/>
+        <w:t>Block orientation (Blockorientierung)</w:t>
+      </w:r>
+    </w:p>
+    <w:p>
+      <w:pPr>
+        <w:spacing w:before="0" w:after="100"/>
+      </w:pPr>
+      <w:r>
+        <w:rPr/>
+        <w:t>This page orients you before the first day. It says what the course is, how a day runs, which documents you will meet, and what is expected of you.</w:t>
+      </w:r>
+    </w:p>
+    <w:p>
+      <w:pPr>
+        <w:pStyle w:val="Heading2"/>
+      </w:pPr>
+      <w:r>
+        <w:rPr/>
+        <w:t>The course: sixteen days, eight modules</w:t>
+      </w:r>
+    </w:p>
+    <w:p>
+      <w:pPr>
+        <w:spacing w:before="0" w:after="100"/>
+      </w:pPr>
+      <w:r>
+        <w:rPr/>
+        <w:t xml:space="preserve">The course </w:t>
+      </w:r>
+      <w:r>
+        <w:rPr>
+          <w:i/>
+        </w:rPr>
+        <w:t>Educational UX/UI Design</w:t>
+      </w:r>
+      <w:r>
+        <w:rPr/>
+        <w:t xml:space="preserve"> (Habmann AufstiegsAkademie, One Stop Digital Learning) runs over sixteen days. One thread runs through every day: </w:t>
+      </w:r>
+      <w:r>
+        <w:rPr>
+          <w:b/>
+        </w:rPr>
+        <w:t>UX is a decision problem, not a design problem.</w:t>
+      </w:r>
+      <w:r>
+        <w:rPr/>
+        <w:t xml:space="preserve"> You are asked to think like a decision-maker, not like a designer: to weigh options against a budget, a deadline and conflicting goals, and to say why.</w:t>
+      </w:r>
+    </w:p>
+    <w:tbl>
+      <w:tblPr>
+        <w:tblW w:w="9638" w:type="dxa"/>
+        <w:tblBorders>
+          <w:top w:val="single" w:sz="4" w:space="0" w:color="D5DEE9"/>
+          <w:left w:val="single" w:sz="4" w:space="0" w:color="D5DEE9"/>
+          <w:bottom w:val="single" w:sz="4" w:space="0" w:color="D5DEE9"/>
+          <w:right w:val="single" w:sz="4" w:space="0" w:color="D5DEE9"/>
+          <w:insideH w:val="single" w:sz="4" w:space="0" w:color="D5DEE9"/>
+          <w:insideV w:val="single" w:sz="4" w:space="0" w:color="D5DEE9"/>
+        </w:tblBorders>
+        <w:tblLayout w:type="fixed"/>
+        <w:tblCellMar>
+          <w:top w:w="60" w:type="dxa"/>
+          <w:left w:w="100" w:type="dxa"/>
+          <w:bottom w:w="60" w:type="dxa"/>
+          <w:right w:w="100" w:type="dxa"/>
+        </w:tblCellMar>
+      </w:tblPr>
+      <w:tblGrid>
+        <w:gridCol w:w="1117"/>
+        <w:gridCol w:w="793"/>
+        <w:gridCol w:w="7728"/>
+      </w:tblGrid>
+      <w:tr>
+        <w:trPr>
+          <w:cantSplit/>
+          <w:tblHeader/>
+        </w:trPr>
+        <w:tc>
+          <w:tcPr>
+            <w:tcW w:type="dxa" w:w="1117"/>
+            <w:shd w:val="clear" w:color="auto" w:fill="E6ECF4"/>
+          </w:tcPr>
+          <w:p>
+            <w:pPr>
+              <w:spacing w:before="0" w:after="0"/>
+            </w:pPr>
+            <w:r>
+              <w:rPr>
+                <w:b/>
+                <w:sz w:val="20"/>
+              </w:rPr>
+              <w:t>Module</w:t>
+            </w:r>
+          </w:p>
+        </w:tc>
+        <w:tc>
+          <w:tcPr>
+            <w:tcW w:type="dxa" w:w="793"/>
+            <w:shd w:val="clear" w:color="auto" w:fill="E6ECF4"/>
+          </w:tcPr>
+          <w:p>
+            <w:pPr>
+              <w:spacing w:before="0" w:after="0"/>
+            </w:pPr>
+            <w:r>
+              <w:rPr>
+                <w:b/>
+                <w:sz w:val="20"/>
+              </w:rPr>
+              <w:t>Day</w:t>
+            </w:r>
+          </w:p>
+        </w:tc>
+        <w:tc>
+          <w:tcPr>
+            <w:tcW w:type="dxa" w:w="7728"/>
+            <w:shd w:val="clear" w:color="auto" w:fill="E6ECF4"/>
+          </w:tcPr>
+          <w:p>
+            <w:pPr>
+              <w:spacing w:before="0" w:after="0"/>
+            </w:pPr>
+            <w:r>
+              <w:rPr>
+                <w:b/>
+                <w:sz w:val="20"/>
+              </w:rPr>
+              <w:t>Topic</w:t>
+            </w:r>
+          </w:p>
+        </w:tc>
+      </w:tr>
+      <w:tr>
+        <w:trPr>
+          <w:cantSplit/>
+        </w:trPr>
+        <w:tc>
+          <w:tcPr>
+            <w:tcW w:type="dxa" w:w="1117"/>
+          </w:tcPr>
+          <w:p>
+            <w:pPr>
+              <w:spacing w:before="0" w:after="0"/>
+            </w:pPr>
+            <w:r>
+              <w:rPr>
+                <w:sz w:val="20"/>
+              </w:rPr>
+              <w:t>Module 1</w:t>
+            </w:r>
+          </w:p>
+        </w:tc>
+        <w:tc>
+          <w:tcPr>
+            <w:tcW w:type="dxa" w:w="793"/>
+          </w:tcPr>
+          <w:p>
+            <w:pPr>
+              <w:spacing w:before="0" w:after="0"/>
+            </w:pPr>
+            <w:r>
+              <w:rPr>
+                <w:sz w:val="20"/>
+              </w:rPr>
+              <w:t>1</w:t>
+            </w:r>
+          </w:p>
+        </w:tc>
+        <w:tc>
+          <w:tcPr>
+            <w:tcW w:type="dxa" w:w="7728"/>
+          </w:tcPr>
+          <w:p>
+            <w:pPr>
+              <w:spacing w:before="0" w:after="0"/>
+            </w:pPr>
+            <w:r>
+              <w:rPr>
+                <w:sz w:val="20"/>
+              </w:rPr>
+              <w:t>Fundamentals of UX/UI design for learning platforms and user-centred design of learning interfaces</w:t>
+            </w:r>
+          </w:p>
+        </w:tc>
+      </w:tr>
+      <w:tr>
+        <w:trPr>
+          <w:cantSplit/>
+        </w:trPr>
+        <w:tc>
+          <w:tcPr>
+            <w:tcW w:type="dxa" w:w="1117"/>
+          </w:tcPr>
+          <w:p>
+            <w:pPr>
+              <w:spacing w:before="0" w:after="0"/>
+            </w:pPr>
+          </w:p>
+        </w:tc>
+        <w:tc>
+          <w:tcPr>
+            <w:tcW w:type="dxa" w:w="793"/>
+          </w:tcPr>
+          <w:p>
+            <w:pPr>
+              <w:spacing w:before="0" w:after="0"/>
+            </w:pPr>
+            <w:r>
+              <w:rPr>
+                <w:sz w:val="20"/>
+              </w:rPr>
+              <w:t>2</w:t>
+            </w:r>
+          </w:p>
+        </w:tc>
+        <w:tc>
+          <w:tcPr>
+            <w:tcW w:type="dxa" w:w="7728"/>
+          </w:tcPr>
+          <w:p>
+            <w:pPr>
+              <w:spacing w:before="0" w:after="0"/>
+            </w:pPr>
+            <w:r>
+              <w:rPr>
+                <w:sz w:val="20"/>
+              </w:rPr>
+              <w:t>Successful e-learning platforms, prototyping and testing, future technologies and adaptive learning</w:t>
+            </w:r>
+          </w:p>
+        </w:tc>
+      </w:tr>
+      <w:tr>
+        <w:trPr>
+          <w:cantSplit/>
+        </w:trPr>
+        <w:tc>
+          <w:tcPr>
+            <w:tcW w:type="dxa" w:w="1117"/>
+          </w:tcPr>
+          <w:p>
+            <w:pPr>
+              <w:spacing w:before="0" w:after="0"/>
+            </w:pPr>
+            <w:r>
+              <w:rPr>
+                <w:sz w:val="20"/>
+              </w:rPr>
+              <w:t>Module 2</w:t>
+            </w:r>
+          </w:p>
+        </w:tc>
+        <w:tc>
+          <w:tcPr>
+            <w:tcW w:type="dxa" w:w="793"/>
+          </w:tcPr>
+          <w:p>
+            <w:pPr>
+              <w:spacing w:before="0" w:after="0"/>
+            </w:pPr>
+            <w:r>
+              <w:rPr>
+                <w:sz w:val="20"/>
+              </w:rPr>
+              <w:t>3</w:t>
+            </w:r>
+          </w:p>
+        </w:tc>
+        <w:tc>
+          <w:tcPr>
+            <w:tcW w:type="dxa" w:w="7728"/>
+          </w:tcPr>
+          <w:p>
+            <w:pPr>
+              <w:spacing w:before="0" w:after="0"/>
+            </w:pPr>
+            <w:r>
+              <w:rPr>
+                <w:sz w:val="20"/>
+              </w:rPr>
+              <w:t>Learning psychology for UX designers, cognitive load and information processing</w:t>
+            </w:r>
+          </w:p>
+        </w:tc>
+      </w:tr>
+      <w:tr>
+        <w:trPr>
+          <w:cantSplit/>
+        </w:trPr>
+        <w:tc>
+          <w:tcPr>
+            <w:tcW w:type="dxa" w:w="1117"/>
+          </w:tcPr>
+          <w:p>
+            <w:pPr>
+              <w:spacing w:before="0" w:after="0"/>
+            </w:pPr>
+          </w:p>
+        </w:tc>
+        <w:tc>
+          <w:tcPr>
+            <w:tcW w:type="dxa" w:w="793"/>
+          </w:tcPr>
+          <w:p>
+            <w:pPr>
+              <w:spacing w:before="0" w:after="0"/>
+            </w:pPr>
+            <w:r>
+              <w:rPr>
+                <w:sz w:val="20"/>
+              </w:rPr>
+              <w:t>4</w:t>
+            </w:r>
+          </w:p>
+        </w:tc>
+        <w:tc>
+          <w:tcPr>
+            <w:tcW w:type="dxa" w:w="7728"/>
+          </w:tcPr>
+          <w:p>
+            <w:pPr>
+              <w:spacing w:before="0" w:after="0"/>
+            </w:pPr>
+            <w:r>
+              <w:rPr>
+                <w:sz w:val="20"/>
+              </w:rPr>
+              <w:t>Motivation and engagement through design psychology, design principles, evaluation of learning-psychology-based UX concepts</w:t>
+            </w:r>
+          </w:p>
+        </w:tc>
+      </w:tr>
+      <w:tr>
+        <w:trPr>
+          <w:cantSplit/>
+        </w:trPr>
+        <w:tc>
+          <w:tcPr>
+            <w:tcW w:type="dxa" w:w="1117"/>
+          </w:tcPr>
+          <w:p>
+            <w:pPr>
+              <w:spacing w:before="0" w:after="0"/>
+            </w:pPr>
+            <w:r>
+              <w:rPr>
+                <w:sz w:val="20"/>
+              </w:rPr>
+              <w:t>Module 3</w:t>
+            </w:r>
+          </w:p>
+        </w:tc>
+        <w:tc>
+          <w:tcPr>
+            <w:tcW w:type="dxa" w:w="793"/>
+          </w:tcPr>
+          <w:p>
+            <w:pPr>
+              <w:spacing w:before="0" w:after="0"/>
+            </w:pPr>
+            <w:r>
+              <w:rPr>
+                <w:sz w:val="20"/>
+              </w:rPr>
+              <w:t>5</w:t>
+            </w:r>
+          </w:p>
+        </w:tc>
+        <w:tc>
+          <w:tcPr>
+            <w:tcW w:type="dxa" w:w="7728"/>
+          </w:tcPr>
+          <w:p>
+            <w:pPr>
+              <w:spacing w:before="0" w:after="0"/>
+            </w:pPr>
+            <w:r>
+              <w:rPr>
+                <w:sz w:val="20"/>
+              </w:rPr>
+              <w:t>Fundamentals of user-centred UX design for learning platforms</w:t>
+            </w:r>
+          </w:p>
+        </w:tc>
+      </w:tr>
+      <w:tr>
+        <w:trPr>
+          <w:cantSplit/>
+        </w:trPr>
+        <w:tc>
+          <w:tcPr>
+            <w:tcW w:type="dxa" w:w="1117"/>
+          </w:tcPr>
+          <w:p>
+            <w:pPr>
+              <w:spacing w:before="0" w:after="0"/>
+            </w:pPr>
+          </w:p>
+        </w:tc>
+        <w:tc>
+          <w:tcPr>
+            <w:tcW w:type="dxa" w:w="793"/>
+          </w:tcPr>
+          <w:p>
+            <w:pPr>
+              <w:spacing w:before="0" w:after="0"/>
+            </w:pPr>
+            <w:r>
+              <w:rPr>
+                <w:sz w:val="20"/>
+              </w:rPr>
+              <w:t>6</w:t>
+            </w:r>
+          </w:p>
+        </w:tc>
+        <w:tc>
+          <w:tcPr>
+            <w:tcW w:type="dxa" w:w="7728"/>
+          </w:tcPr>
+          <w:p>
+            <w:pPr>
+              <w:spacing w:before="0" w:after="0"/>
+            </w:pPr>
+            <w:r>
+              <w:rPr>
+                <w:sz w:val="20"/>
+              </w:rPr>
+              <w:t>Personas for learners and teachers, user journeys in the learning context</w:t>
+            </w:r>
+          </w:p>
+        </w:tc>
+      </w:tr>
+      <w:tr>
+        <w:trPr>
+          <w:cantSplit/>
+        </w:trPr>
+        <w:tc>
+          <w:tcPr>
+            <w:tcW w:type="dxa" w:w="1117"/>
+          </w:tcPr>
+          <w:p>
+            <w:pPr>
+              <w:spacing w:before="0" w:after="0"/>
+            </w:pPr>
+          </w:p>
+        </w:tc>
+        <w:tc>
+          <w:tcPr>
+            <w:tcW w:type="dxa" w:w="793"/>
+          </w:tcPr>
+          <w:p>
+            <w:pPr>
+              <w:spacing w:before="0" w:after="0"/>
+            </w:pPr>
+            <w:r>
+              <w:rPr>
+                <w:sz w:val="20"/>
+              </w:rPr>
+              <w:t>7</w:t>
+            </w:r>
+          </w:p>
+        </w:tc>
+        <w:tc>
+          <w:tcPr>
+            <w:tcW w:type="dxa" w:w="7728"/>
+          </w:tcPr>
+          <w:p>
+            <w:pPr>
+              <w:spacing w:before="0" w:after="0"/>
+            </w:pPr>
+            <w:r>
+              <w:rPr>
+                <w:sz w:val="20"/>
+              </w:rPr>
+              <w:t>Accessibility and inclusive design, integration and evaluation of user-centred UX concepts</w:t>
+            </w:r>
+          </w:p>
+        </w:tc>
+      </w:tr>
+      <w:tr>
+        <w:trPr>
+          <w:cantSplit/>
+        </w:trPr>
+        <w:tc>
+          <w:tcPr>
+            <w:tcW w:type="dxa" w:w="1117"/>
+          </w:tcPr>
+          <w:p>
+            <w:pPr>
+              <w:spacing w:before="0" w:after="0"/>
+            </w:pPr>
+            <w:r>
+              <w:rPr>
+                <w:sz w:val="20"/>
+              </w:rPr>
+              <w:t>Module 4</w:t>
+            </w:r>
+          </w:p>
+        </w:tc>
+        <w:tc>
+          <w:tcPr>
+            <w:tcW w:type="dxa" w:w="793"/>
+          </w:tcPr>
+          <w:p>
+            <w:pPr>
+              <w:spacing w:before="0" w:after="0"/>
+            </w:pPr>
+            <w:r>
+              <w:rPr>
+                <w:sz w:val="20"/>
+              </w:rPr>
+              <w:t>8</w:t>
+            </w:r>
+          </w:p>
+        </w:tc>
+        <w:tc>
+          <w:tcPr>
+            <w:tcW w:type="dxa" w:w="7728"/>
+          </w:tcPr>
+          <w:p>
+            <w:pPr>
+              <w:spacing w:before="0" w:after="0"/>
+            </w:pPr>
+            <w:r>
+              <w:rPr>
+                <w:sz w:val="20"/>
+              </w:rPr>
+              <w:t>Fundamentals of UX/UI design for digital learning environments</w:t>
+            </w:r>
+          </w:p>
+        </w:tc>
+      </w:tr>
+      <w:tr>
+        <w:trPr>
+          <w:cantSplit/>
+        </w:trPr>
+        <w:tc>
+          <w:tcPr>
+            <w:tcW w:type="dxa" w:w="1117"/>
+          </w:tcPr>
+          <w:p>
+            <w:pPr>
+              <w:spacing w:before="0" w:after="0"/>
+            </w:pPr>
+          </w:p>
+        </w:tc>
+        <w:tc>
+          <w:tcPr>
+            <w:tcW w:type="dxa" w:w="793"/>
+          </w:tcPr>
+          <w:p>
+            <w:pPr>
+              <w:spacing w:before="0" w:after="0"/>
+            </w:pPr>
+            <w:r>
+              <w:rPr>
+                <w:sz w:val="20"/>
+              </w:rPr>
+              <w:t>9</w:t>
+            </w:r>
+          </w:p>
+        </w:tc>
+        <w:tc>
+          <w:tcPr>
+            <w:tcW w:type="dxa" w:w="7728"/>
+          </w:tcPr>
+          <w:p>
+            <w:pPr>
+              <w:spacing w:before="0" w:after="0"/>
+            </w:pPr>
+            <w:r>
+              <w:rPr>
+                <w:sz w:val="20"/>
+              </w:rPr>
+              <w:t>Information architecture and navigation, interactive elements and engagement strategies</w:t>
+            </w:r>
+          </w:p>
+        </w:tc>
+      </w:tr>
+      <w:tr>
+        <w:trPr>
+          <w:cantSplit/>
+        </w:trPr>
+        <w:tc>
+          <w:tcPr>
+            <w:tcW w:type="dxa" w:w="1117"/>
+          </w:tcPr>
+          <w:p>
+            <w:pPr>
+              <w:spacing w:before="0" w:after="0"/>
+            </w:pPr>
+          </w:p>
+        </w:tc>
+        <w:tc>
+          <w:tcPr>
+            <w:tcW w:type="dxa" w:w="793"/>
+          </w:tcPr>
+          <w:p>
+            <w:pPr>
+              <w:spacing w:before="0" w:after="0"/>
+            </w:pPr>
+            <w:r>
+              <w:rPr>
+                <w:sz w:val="20"/>
+              </w:rPr>
+              <w:t>10</w:t>
+            </w:r>
+          </w:p>
+        </w:tc>
+        <w:tc>
+          <w:tcPr>
+            <w:tcW w:type="dxa" w:w="7728"/>
+          </w:tcPr>
+          <w:p>
+            <w:pPr>
+              <w:spacing w:before="0" w:after="0"/>
+            </w:pPr>
+            <w:r>
+              <w:rPr>
+                <w:sz w:val="20"/>
+              </w:rPr>
+              <w:t>Visual feedback and progress tracking, responsive design and accessibility</w:t>
+            </w:r>
+          </w:p>
+        </w:tc>
+      </w:tr>
+      <w:tr>
+        <w:trPr>
+          <w:cantSplit/>
+        </w:trPr>
+        <w:tc>
+          <w:tcPr>
+            <w:tcW w:type="dxa" w:w="1117"/>
+          </w:tcPr>
+          <w:p>
+            <w:pPr>
+              <w:spacing w:before="0" w:after="0"/>
+            </w:pPr>
+            <w:r>
+              <w:rPr>
+                <w:sz w:val="20"/>
+              </w:rPr>
+              <w:t>Module 5</w:t>
+            </w:r>
+          </w:p>
+        </w:tc>
+        <w:tc>
+          <w:tcPr>
+            <w:tcW w:type="dxa" w:w="793"/>
+          </w:tcPr>
+          <w:p>
+            <w:pPr>
+              <w:spacing w:before="0" w:after="0"/>
+            </w:pPr>
+            <w:r>
+              <w:rPr>
+                <w:sz w:val="20"/>
+              </w:rPr>
+              <w:t>11</w:t>
+            </w:r>
+          </w:p>
+        </w:tc>
+        <w:tc>
+          <w:tcPr>
+            <w:tcW w:type="dxa" w:w="7728"/>
+          </w:tcPr>
+          <w:p>
+            <w:pPr>
+              <w:spacing w:before="0" w:after="0"/>
+            </w:pPr>
+            <w:r>
+              <w:rPr>
+                <w:sz w:val="20"/>
+              </w:rPr>
+              <w:t>Fundamentals of gamification in UX design, psychological foundations and motivation theories</w:t>
+            </w:r>
+          </w:p>
+        </w:tc>
+      </w:tr>
+      <w:tr>
+        <w:trPr>
+          <w:cantSplit/>
+        </w:trPr>
+        <w:tc>
+          <w:tcPr>
+            <w:tcW w:type="dxa" w:w="1117"/>
+          </w:tcPr>
+          <w:p>
+            <w:pPr>
+              <w:spacing w:before="0" w:after="0"/>
+            </w:pPr>
+          </w:p>
+        </w:tc>
+        <w:tc>
+          <w:tcPr>
+            <w:tcW w:type="dxa" w:w="793"/>
+          </w:tcPr>
+          <w:p>
+            <w:pPr>
+              <w:spacing w:before="0" w:after="0"/>
+            </w:pPr>
+            <w:r>
+              <w:rPr>
+                <w:sz w:val="20"/>
+              </w:rPr>
+              <w:t>12</w:t>
+            </w:r>
+          </w:p>
+        </w:tc>
+        <w:tc>
+          <w:tcPr>
+            <w:tcW w:type="dxa" w:w="7728"/>
+          </w:tcPr>
+          <w:p>
+            <w:pPr>
+              <w:spacing w:before="0" w:after="0"/>
+            </w:pPr>
+            <w:r>
+              <w:rPr>
+                <w:sz w:val="20"/>
+              </w:rPr>
+              <w:t>Adaptive learning systems, UX patterns for personalised paths, practical project: a gamified platform</w:t>
+            </w:r>
+          </w:p>
+        </w:tc>
+      </w:tr>
+      <w:tr>
+        <w:trPr>
+          <w:cantSplit/>
+        </w:trPr>
+        <w:tc>
+          <w:tcPr>
+            <w:tcW w:type="dxa" w:w="1117"/>
+          </w:tcPr>
+          <w:p>
+            <w:pPr>
+              <w:spacing w:before="0" w:after="0"/>
+            </w:pPr>
+            <w:r>
+              <w:rPr>
+                <w:sz w:val="20"/>
+              </w:rPr>
+              <w:t>Module 6</w:t>
+            </w:r>
+          </w:p>
+        </w:tc>
+        <w:tc>
+          <w:tcPr>
+            <w:tcW w:type="dxa" w:w="793"/>
+          </w:tcPr>
+          <w:p>
+            <w:pPr>
+              <w:spacing w:before="0" w:after="0"/>
+            </w:pPr>
+            <w:r>
+              <w:rPr>
+                <w:sz w:val="20"/>
+              </w:rPr>
+              <w:t>13</w:t>
+            </w:r>
+          </w:p>
+        </w:tc>
+        <w:tc>
+          <w:tcPr>
+            <w:tcW w:type="dxa" w:w="7728"/>
+          </w:tcPr>
+          <w:p>
+            <w:pPr>
+              <w:spacing w:before="0" w:after="0"/>
+            </w:pPr>
+            <w:r>
+              <w:rPr>
+                <w:sz w:val="20"/>
+              </w:rPr>
+              <w:t>Inclusive UX/UI design and accessibility in practice: WCAG</w:t>
+            </w:r>
+          </w:p>
+        </w:tc>
+      </w:tr>
+      <w:tr>
+        <w:trPr>
+          <w:cantSplit/>
+        </w:trPr>
+        <w:tc>
+          <w:tcPr>
+            <w:tcW w:type="dxa" w:w="1117"/>
+          </w:tcPr>
+          <w:p>
+            <w:pPr>
+              <w:spacing w:before="0" w:after="0"/>
+            </w:pPr>
+          </w:p>
+        </w:tc>
+        <w:tc>
+          <w:tcPr>
+            <w:tcW w:type="dxa" w:w="793"/>
+          </w:tcPr>
+          <w:p>
+            <w:pPr>
+              <w:spacing w:before="0" w:after="0"/>
+            </w:pPr>
+            <w:r>
+              <w:rPr>
+                <w:sz w:val="20"/>
+              </w:rPr>
+              <w:t>14</w:t>
+            </w:r>
+          </w:p>
+        </w:tc>
+        <w:tc>
+          <w:tcPr>
+            <w:tcW w:type="dxa" w:w="7728"/>
+          </w:tcPr>
+          <w:p>
+            <w:pPr>
+              <w:spacing w:before="0" w:after="0"/>
+            </w:pPr>
+            <w:r>
+              <w:rPr>
+                <w:sz w:val="20"/>
+              </w:rPr>
+              <w:t>Plain language, intuitive learning environments, testing and optimising inclusive design</w:t>
+            </w:r>
+          </w:p>
+        </w:tc>
+      </w:tr>
+      <w:tr>
+        <w:trPr>
+          <w:cantSplit/>
+        </w:trPr>
+        <w:tc>
+          <w:tcPr>
+            <w:tcW w:type="dxa" w:w="1117"/>
+          </w:tcPr>
+          <w:p>
+            <w:pPr>
+              <w:spacing w:before="0" w:after="0"/>
+            </w:pPr>
+            <w:r>
+              <w:rPr>
+                <w:sz w:val="20"/>
+              </w:rPr>
+              <w:t>Module 7</w:t>
+            </w:r>
+          </w:p>
+        </w:tc>
+        <w:tc>
+          <w:tcPr>
+            <w:tcW w:type="dxa" w:w="793"/>
+          </w:tcPr>
+          <w:p>
+            <w:pPr>
+              <w:spacing w:before="0" w:after="0"/>
+            </w:pPr>
+            <w:r>
+              <w:rPr>
+                <w:sz w:val="20"/>
+              </w:rPr>
+              <w:t>15</w:t>
+            </w:r>
+          </w:p>
+        </w:tc>
+        <w:tc>
+          <w:tcPr>
+            <w:tcW w:type="dxa" w:w="7728"/>
+          </w:tcPr>
+          <w:p>
+            <w:pPr>
+              <w:spacing w:before="0" w:after="0"/>
+            </w:pPr>
+            <w:r>
+              <w:rPr>
+                <w:sz w:val="20"/>
+              </w:rPr>
+              <w:t>Mobile learning UX, microlearning, responsive design, cross-device optimisation</w:t>
+            </w:r>
+          </w:p>
+        </w:tc>
+      </w:tr>
+      <w:tr>
+        <w:trPr>
+          <w:cantSplit/>
+        </w:trPr>
+        <w:tc>
+          <w:tcPr>
+            <w:tcW w:type="dxa" w:w="1117"/>
+          </w:tcPr>
+          <w:p>
+            <w:pPr>
+              <w:spacing w:before="0" w:after="0"/>
+            </w:pPr>
+            <w:r>
+              <w:rPr>
+                <w:sz w:val="20"/>
+              </w:rPr>
+              <w:t>Module 8</w:t>
+            </w:r>
+          </w:p>
+        </w:tc>
+        <w:tc>
+          <w:tcPr>
+            <w:tcW w:type="dxa" w:w="793"/>
+          </w:tcPr>
+          <w:p>
+            <w:pPr>
+              <w:spacing w:before="0" w:after="0"/>
+            </w:pPr>
+            <w:r>
+              <w:rPr>
+                <w:sz w:val="20"/>
+              </w:rPr>
+              <w:t>16</w:t>
+            </w:r>
+          </w:p>
+        </w:tc>
+        <w:tc>
+          <w:tcPr>
+            <w:tcW w:type="dxa" w:w="7728"/>
+          </w:tcPr>
+          <w:p>
+            <w:pPr>
+              <w:spacing w:before="0" w:after="0"/>
+            </w:pPr>
+            <w:r>
+              <w:rPr>
+                <w:sz w:val="20"/>
+              </w:rPr>
+              <w:t>UX testing, analytics tools and tracking, KPIs, data-driven optimisation</w:t>
+            </w:r>
+          </w:p>
+        </w:tc>
+      </w:tr>
+    </w:tbl>
+    <w:p>
+      <w:pPr>
+        <w:spacing w:before="0" w:after="80"/>
+      </w:pPr>
+    </w:p>
+    <w:p>
+      <w:pPr>
+        <w:spacing w:before="0" w:after="100"/>
+      </w:pPr>
+      <w:r>
+        <w:rPr/>
+        <w:t>This release contains the documents for Days 1 to 8. The documents for Days 9 to 16 follow in the same form.</w:t>
+      </w:r>
+    </w:p>
+    <w:p>
+      <w:pPr>
+        <w:pStyle w:val="Heading2"/>
+      </w:pPr>
+      <w:r>
+        <w:rPr/>
+        <w:t>How every day runs</w:t>
+      </w:r>
+    </w:p>
+    <w:p>
+      <w:pPr>
+        <w:spacing w:before="0" w:after="100"/>
+      </w:pPr>
+      <w:r>
+        <w:rPr/>
+        <w:t>Every day has the same ten teaching units (UE) and the same three levels of work.</w:t>
+      </w:r>
+    </w:p>
+    <w:tbl>
+      <w:tblPr>
+        <w:tblW w:w="9638" w:type="dxa"/>
+        <w:tblBorders>
+          <w:top w:val="single" w:sz="4" w:space="0" w:color="D5DEE9"/>
+          <w:left w:val="single" w:sz="4" w:space="0" w:color="D5DEE9"/>
+          <w:bottom w:val="single" w:sz="4" w:space="0" w:color="D5DEE9"/>
+          <w:right w:val="single" w:sz="4" w:space="0" w:color="D5DEE9"/>
+          <w:insideH w:val="single" w:sz="4" w:space="0" w:color="D5DEE9"/>
+          <w:insideV w:val="single" w:sz="4" w:space="0" w:color="D5DEE9"/>
+        </w:tblBorders>
+        <w:tblLayout w:type="fixed"/>
+        <w:tblCellMar>
+          <w:top w:w="60" w:type="dxa"/>
+          <w:left w:w="100" w:type="dxa"/>
+          <w:bottom w:w="60" w:type="dxa"/>
+          <w:right w:w="100" w:type="dxa"/>
+        </w:tblCellMar>
+      </w:tblPr>
+      <w:tblGrid>
+        <w:gridCol w:w="987"/>
+        <w:gridCol w:w="5765"/>
+        <w:gridCol w:w="2886"/>
+      </w:tblGrid>
+      <w:tr>
+        <w:trPr>
+          <w:cantSplit/>
+          <w:tblHeader/>
+        </w:trPr>
+        <w:tc>
+          <w:tcPr>
+            <w:tcW w:type="dxa" w:w="987"/>
+            <w:shd w:val="clear" w:color="auto" w:fill="E6ECF4"/>
+          </w:tcPr>
+          <w:p>
+            <w:pPr>
+              <w:spacing w:before="0" w:after="0"/>
+            </w:pPr>
+            <w:r>
+              <w:rPr>
+                <w:b/>
+                <w:sz w:val="20"/>
+              </w:rPr>
+              <w:t>UE</w:t>
+            </w:r>
+          </w:p>
+        </w:tc>
+        <w:tc>
+          <w:tcPr>
+            <w:tcW w:type="dxa" w:w="5765"/>
+            <w:shd w:val="clear" w:color="auto" w:fill="E6ECF4"/>
+          </w:tcPr>
+          <w:p>
+            <w:pPr>
+              <w:spacing w:before="0" w:after="0"/>
+            </w:pPr>
+            <w:r>
+              <w:rPr>
+                <w:b/>
+                <w:sz w:val="20"/>
+              </w:rPr>
+              <w:t>What happens</w:t>
+            </w:r>
+          </w:p>
+        </w:tc>
+        <w:tc>
+          <w:tcPr>
+            <w:tcW w:type="dxa" w:w="2886"/>
+            <w:shd w:val="clear" w:color="auto" w:fill="E6ECF4"/>
+          </w:tcPr>
+          <w:p>
+            <w:pPr>
+              <w:spacing w:before="0" w:after="0"/>
+            </w:pPr>
+            <w:r>
+              <w:rPr>
+                <w:b/>
+                <w:sz w:val="20"/>
+              </w:rPr>
+              <w:t>Level</w:t>
+            </w:r>
+          </w:p>
+        </w:tc>
+      </w:tr>
+      <w:tr>
+        <w:trPr>
+          <w:cantSplit/>
+        </w:trPr>
+        <w:tc>
+          <w:tcPr>
+            <w:tcW w:type="dxa" w:w="987"/>
+          </w:tcPr>
+          <w:p>
+            <w:pPr>
+              <w:spacing w:before="0" w:after="0"/>
+            </w:pPr>
+            <w:r>
+              <w:rPr>
+                <w:sz w:val="20"/>
+              </w:rPr>
+              <w:t>1</w:t>
+            </w:r>
+          </w:p>
+        </w:tc>
+        <w:tc>
+          <w:tcPr>
+            <w:tcW w:type="dxa" w:w="5765"/>
+          </w:tcPr>
+          <w:p>
+            <w:pPr>
+              <w:spacing w:before="0" w:after="0"/>
+            </w:pPr>
+            <w:r>
+              <w:rPr>
+                <w:sz w:val="20"/>
+              </w:rPr>
+              <w:t>Knowledge transfer: the trainer presents the day's topic</w:t>
+            </w:r>
+          </w:p>
+        </w:tc>
+        <w:tc>
+          <w:tcPr>
+            <w:tcW w:type="dxa" w:w="2886"/>
+          </w:tcPr>
+          <w:p>
+            <w:pPr>
+              <w:spacing w:before="0" w:after="0"/>
+            </w:pPr>
+            <w:r>
+              <w:rPr>
+                <w:sz w:val="20"/>
+              </w:rPr>
+              <w:t>Level 1 · Knowledge</w:t>
+            </w:r>
+          </w:p>
+        </w:tc>
+      </w:tr>
+      <w:tr>
+        <w:trPr>
+          <w:cantSplit/>
+        </w:trPr>
+        <w:tc>
+          <w:tcPr>
+            <w:tcW w:type="dxa" w:w="987"/>
+          </w:tcPr>
+          <w:p>
+            <w:pPr>
+              <w:spacing w:before="0" w:after="0"/>
+            </w:pPr>
+            <w:r>
+              <w:rPr>
+                <w:sz w:val="20"/>
+              </w:rPr>
+              <w:t>2–3</w:t>
+            </w:r>
+          </w:p>
+        </w:tc>
+        <w:tc>
+          <w:tcPr>
+            <w:tcW w:type="dxa" w:w="5765"/>
+          </w:tcPr>
+          <w:p>
+            <w:pPr>
+              <w:spacing w:before="0" w:after="0"/>
+            </w:pPr>
+            <w:r>
+              <w:rPr>
+                <w:sz w:val="20"/>
+              </w:rPr>
+              <w:t>Two short tasks: take the user's side, then weigh options under limits</w:t>
+            </w:r>
+          </w:p>
+        </w:tc>
+        <w:tc>
+          <w:tcPr>
+            <w:tcW w:type="dxa" w:w="2886"/>
+          </w:tcPr>
+          <w:p>
+            <w:pPr>
+              <w:spacing w:before="0" w:after="0"/>
+            </w:pPr>
+            <w:r>
+              <w:rPr>
+                <w:sz w:val="20"/>
+              </w:rPr>
+              <w:t>Level 1 · Knowledge</w:t>
+            </w:r>
+          </w:p>
+        </w:tc>
+      </w:tr>
+      <w:tr>
+        <w:trPr>
+          <w:cantSplit/>
+        </w:trPr>
+        <w:tc>
+          <w:tcPr>
+            <w:tcW w:type="dxa" w:w="987"/>
+          </w:tcPr>
+          <w:p>
+            <w:pPr>
+              <w:spacing w:before="0" w:after="0"/>
+            </w:pPr>
+            <w:r>
+              <w:rPr>
+                <w:sz w:val="20"/>
+              </w:rPr>
+              <w:t>4</w:t>
+            </w:r>
+          </w:p>
+        </w:tc>
+        <w:tc>
+          <w:tcPr>
+            <w:tcW w:type="dxa" w:w="5765"/>
+          </w:tcPr>
+          <w:p>
+            <w:pPr>
+              <w:spacing w:before="0" w:after="0"/>
+            </w:pPr>
+            <w:r>
+              <w:rPr>
+                <w:sz w:val="20"/>
+              </w:rPr>
+              <w:t>Coaching: from understanding to application</w:t>
+            </w:r>
+          </w:p>
+        </w:tc>
+        <w:tc>
+          <w:tcPr>
+            <w:tcW w:type="dxa" w:w="2886"/>
+          </w:tcPr>
+          <w:p>
+            <w:pPr>
+              <w:spacing w:before="0" w:after="0"/>
+            </w:pPr>
+            <w:r>
+              <w:rPr>
+                <w:sz w:val="20"/>
+              </w:rPr>
+              <w:t>Level 1 to 2</w:t>
+            </w:r>
+          </w:p>
+        </w:tc>
+      </w:tr>
+      <w:tr>
+        <w:trPr>
+          <w:cantSplit/>
+        </w:trPr>
+        <w:tc>
+          <w:tcPr>
+            <w:tcW w:type="dxa" w:w="987"/>
+          </w:tcPr>
+          <w:p>
+            <w:pPr>
+              <w:spacing w:before="0" w:after="0"/>
+            </w:pPr>
+            <w:r>
+              <w:rPr>
+                <w:sz w:val="20"/>
+              </w:rPr>
+              <w:t>5–6</w:t>
+            </w:r>
+          </w:p>
+        </w:tc>
+        <w:tc>
+          <w:tcPr>
+            <w:tcW w:type="dxa" w:w="5765"/>
+          </w:tcPr>
+          <w:p>
+            <w:pPr>
+              <w:spacing w:before="0" w:after="0"/>
+            </w:pPr>
+            <w:r>
+              <w:rPr>
+                <w:sz w:val="20"/>
+              </w:rPr>
+              <w:t>Case study (2 UE) with a model solution</w:t>
+            </w:r>
+          </w:p>
+        </w:tc>
+        <w:tc>
+          <w:tcPr>
+            <w:tcW w:type="dxa" w:w="2886"/>
+          </w:tcPr>
+          <w:p>
+            <w:pPr>
+              <w:spacing w:before="0" w:after="0"/>
+            </w:pPr>
+            <w:r>
+              <w:rPr>
+                <w:sz w:val="20"/>
+              </w:rPr>
+              <w:t>Level 2 · Application</w:t>
+            </w:r>
+          </w:p>
+        </w:tc>
+      </w:tr>
+      <w:tr>
+        <w:trPr>
+          <w:cantSplit/>
+        </w:trPr>
+        <w:tc>
+          <w:tcPr>
+            <w:tcW w:type="dxa" w:w="987"/>
+          </w:tcPr>
+          <w:p>
+            <w:pPr>
+              <w:spacing w:before="0" w:after="0"/>
+            </w:pPr>
+            <w:r>
+              <w:rPr>
+                <w:sz w:val="20"/>
+              </w:rPr>
+              <w:t>7</w:t>
+            </w:r>
+          </w:p>
+        </w:tc>
+        <w:tc>
+          <w:tcPr>
+            <w:tcW w:type="dxa" w:w="5765"/>
+          </w:tcPr>
+          <w:p>
+            <w:pPr>
+              <w:spacing w:before="0" w:after="0"/>
+            </w:pPr>
+            <w:r>
+              <w:rPr>
+                <w:sz w:val="20"/>
+              </w:rPr>
+              <w:t>Feedback round with a management perspective</w:t>
+            </w:r>
+          </w:p>
+        </w:tc>
+        <w:tc>
+          <w:tcPr>
+            <w:tcW w:type="dxa" w:w="2886"/>
+          </w:tcPr>
+          <w:p>
+            <w:pPr>
+              <w:spacing w:before="0" w:after="0"/>
+            </w:pPr>
+            <w:r>
+              <w:rPr>
+                <w:sz w:val="20"/>
+              </w:rPr>
+              <w:t>Level 2 + 3</w:t>
+            </w:r>
+          </w:p>
+        </w:tc>
+      </w:tr>
+      <w:tr>
+        <w:trPr>
+          <w:cantSplit/>
+        </w:trPr>
+        <w:tc>
+          <w:tcPr>
+            <w:tcW w:type="dxa" w:w="987"/>
+          </w:tcPr>
+          <w:p>
+            <w:pPr>
+              <w:spacing w:before="0" w:after="0"/>
+            </w:pPr>
+            <w:r>
+              <w:rPr>
+                <w:sz w:val="20"/>
+              </w:rPr>
+              <w:t>8–10</w:t>
+            </w:r>
+          </w:p>
+        </w:tc>
+        <w:tc>
+          <w:tcPr>
+            <w:tcW w:type="dxa" w:w="5765"/>
+          </w:tcPr>
+          <w:p>
+            <w:pPr>
+              <w:spacing w:before="0" w:after="0"/>
+            </w:pPr>
+            <w:r>
+              <w:rPr>
+                <w:sz w:val="20"/>
+              </w:rPr>
+              <w:t>Transfer project (3 UE): you take a management role and decide</w:t>
+            </w:r>
+          </w:p>
+        </w:tc>
+        <w:tc>
+          <w:tcPr>
+            <w:tcW w:type="dxa" w:w="2886"/>
+          </w:tcPr>
+          <w:p>
+            <w:pPr>
+              <w:spacing w:before="0" w:after="0"/>
+            </w:pPr>
+            <w:r>
+              <w:rPr>
+                <w:sz w:val="20"/>
+              </w:rPr>
+              <w:t>Level 3 · Management decision</w:t>
+            </w:r>
+          </w:p>
+        </w:tc>
+      </w:tr>
+    </w:tbl>
+    <w:p>
+      <w:pPr>
+        <w:spacing w:before="0" w:after="80"/>
+      </w:pPr>
+    </w:p>
+    <w:p>
+      <w:pPr>
+        <w:spacing w:before="0" w:after="100"/>
+      </w:pPr>
+      <w:r>
+        <w:rPr>
+          <w:b/>
+        </w:rPr>
+        <w:t>Level 1</w:t>
+      </w:r>
+      <w:r>
+        <w:rPr/>
+        <w:t xml:space="preserve"> asks you to understand and to take the learner's side. </w:t>
+      </w:r>
+      <w:r>
+        <w:rPr>
+          <w:b/>
+        </w:rPr>
+        <w:t>Level 2</w:t>
+      </w:r>
+      <w:r>
+        <w:rPr/>
+        <w:t xml:space="preserve"> asks you to analyse a learning interface and make first design decisions. </w:t>
+      </w:r>
+      <w:r>
+        <w:rPr>
+          <w:b/>
+        </w:rPr>
+        <w:t>Level 3</w:t>
+      </w:r>
+      <w:r>
+        <w:rPr/>
+        <w:t xml:space="preserve"> asks you to decide as a manager: to set priorities between user value, effort and business goals, and to decide even when the data is incomplete.</w:t>
+      </w:r>
+    </w:p>
+    <w:p>
+      <w:pPr>
+        <w:pStyle w:val="Heading2"/>
+      </w:pPr>
+      <w:r>
+        <w:rPr/>
+        <w:t>Your documents and the playground</w:t>
+      </w:r>
+    </w:p>
+    <w:tbl>
+      <w:tblPr>
+        <w:tblW w:w="9638" w:type="dxa"/>
+        <w:tblBorders>
+          <w:top w:val="single" w:sz="4" w:space="0" w:color="D5DEE9"/>
+          <w:left w:val="single" w:sz="4" w:space="0" w:color="D5DEE9"/>
+          <w:bottom w:val="single" w:sz="4" w:space="0" w:color="D5DEE9"/>
+          <w:right w:val="single" w:sz="4" w:space="0" w:color="D5DEE9"/>
+          <w:insideH w:val="single" w:sz="4" w:space="0" w:color="D5DEE9"/>
+          <w:insideV w:val="single" w:sz="4" w:space="0" w:color="D5DEE9"/>
+        </w:tblBorders>
+        <w:tblLayout w:type="fixed"/>
+        <w:tblCellMar>
+          <w:top w:w="60" w:type="dxa"/>
+          <w:left w:w="100" w:type="dxa"/>
+          <w:bottom w:w="60" w:type="dxa"/>
+          <w:right w:w="100" w:type="dxa"/>
+        </w:tblCellMar>
+      </w:tblPr>
+      <w:tblGrid>
+        <w:gridCol w:w="1601"/>
+        <w:gridCol w:w="6118"/>
+        <w:gridCol w:w="1919"/>
+      </w:tblGrid>
+      <w:tr>
+        <w:trPr>
+          <w:cantSplit/>
+          <w:tblHeader/>
+        </w:trPr>
+        <w:tc>
+          <w:tcPr>
+            <w:tcW w:type="dxa" w:w="1601"/>
+            <w:shd w:val="clear" w:color="auto" w:fill="E6ECF4"/>
+          </w:tcPr>
+          <w:p>
+            <w:pPr>
+              <w:spacing w:before="0" w:after="0"/>
+            </w:pPr>
+            <w:r>
+              <w:rPr>
+                <w:b/>
+                <w:sz w:val="20"/>
+              </w:rPr>
+              <w:t>Document</w:t>
+            </w:r>
+          </w:p>
+        </w:tc>
+        <w:tc>
+          <w:tcPr>
+            <w:tcW w:type="dxa" w:w="6118"/>
+            <w:shd w:val="clear" w:color="auto" w:fill="E6ECF4"/>
+          </w:tcPr>
+          <w:p>
+            <w:pPr>
+              <w:spacing w:before="0" w:after="0"/>
+            </w:pPr>
+            <w:r>
+              <w:rPr>
+                <w:b/>
+                <w:sz w:val="20"/>
+              </w:rPr>
+              <w:t>What it is</w:t>
+            </w:r>
+          </w:p>
+        </w:tc>
+        <w:tc>
+          <w:tcPr>
+            <w:tcW w:type="dxa" w:w="1919"/>
+            <w:shd w:val="clear" w:color="auto" w:fill="E6ECF4"/>
+          </w:tcPr>
+          <w:p>
+            <w:pPr>
+              <w:spacing w:before="0" w:after="0"/>
+            </w:pPr>
+            <w:r>
+              <w:rPr>
+                <w:b/>
+                <w:sz w:val="20"/>
+              </w:rPr>
+              <w:t>Who has it</w:t>
+            </w:r>
+          </w:p>
+        </w:tc>
+      </w:tr>
+      <w:tr>
+        <w:trPr>
+          <w:cantSplit/>
+        </w:trPr>
+        <w:tc>
+          <w:tcPr>
+            <w:tcW w:type="dxa" w:w="1601"/>
+          </w:tcPr>
+          <w:p>
+            <w:pPr>
+              <w:spacing w:before="0" w:after="0"/>
+            </w:pPr>
+            <w:r>
+              <w:rPr>
+                <w:b/>
+                <w:sz w:val="20"/>
+              </w:rPr>
+              <w:t>Materi</w:t>
+            </w:r>
+            <w:r>
+              <w:rPr>
+                <w:sz w:val="20"/>
+              </w:rPr>
+              <w:t xml:space="preserve"> (A and B)</w:t>
+            </w:r>
+          </w:p>
+        </w:tc>
+        <w:tc>
+          <w:tcPr>
+            <w:tcW w:type="dxa" w:w="6118"/>
+          </w:tcPr>
+          <w:p>
+            <w:pPr>
+              <w:spacing w:before="0" w:after="0"/>
+            </w:pPr>
+            <w:r>
+              <w:rPr>
+                <w:sz w:val="20"/>
+              </w:rPr>
+              <w:t>Study material. Materi A serves Route 1 (Levels 1 and 2); Materi B serves Route 2 (Level 3).</w:t>
+            </w:r>
+          </w:p>
+        </w:tc>
+        <w:tc>
+          <w:tcPr>
+            <w:tcW w:type="dxa" w:w="1919"/>
+          </w:tcPr>
+          <w:p>
+            <w:pPr>
+              <w:spacing w:before="0" w:after="0"/>
+            </w:pPr>
+            <w:r>
+              <w:rPr>
+                <w:sz w:val="20"/>
+              </w:rPr>
+              <w:t>Participants (handout)</w:t>
+            </w:r>
+          </w:p>
+        </w:tc>
+      </w:tr>
+      <w:tr>
+        <w:trPr>
+          <w:cantSplit/>
+        </w:trPr>
+        <w:tc>
+          <w:tcPr>
+            <w:tcW w:type="dxa" w:w="1601"/>
+          </w:tcPr>
+          <w:p>
+            <w:pPr>
+              <w:spacing w:before="0" w:after="0"/>
+            </w:pPr>
+            <w:r>
+              <w:rPr>
+                <w:b/>
+                <w:sz w:val="20"/>
+              </w:rPr>
+              <w:t>Task</w:t>
+            </w:r>
+            <w:r>
+              <w:rPr>
+                <w:sz w:val="20"/>
+              </w:rPr>
+              <w:t xml:space="preserve"> (1 and 2)</w:t>
+            </w:r>
+          </w:p>
+        </w:tc>
+        <w:tc>
+          <w:tcPr>
+            <w:tcW w:type="dxa" w:w="6118"/>
+          </w:tcPr>
+          <w:p>
+            <w:pPr>
+              <w:spacing w:before="0" w:after="0"/>
+            </w:pPr>
+            <w:r>
+              <w:rPr>
+                <w:sz w:val="20"/>
+              </w:rPr>
+              <w:t>The worksheet with answer boxes. Task 1 is Route 1; Task 2 is Route 2. There are no answer keys and no scores in it.</w:t>
+            </w:r>
+          </w:p>
+        </w:tc>
+        <w:tc>
+          <w:tcPr>
+            <w:tcW w:type="dxa" w:w="1919"/>
+          </w:tcPr>
+          <w:p>
+            <w:pPr>
+              <w:spacing w:before="0" w:after="0"/>
+            </w:pPr>
+            <w:r>
+              <w:rPr>
+                <w:sz w:val="20"/>
+              </w:rPr>
+              <w:t>Participants (handout)</w:t>
+            </w:r>
+          </w:p>
+        </w:tc>
+      </w:tr>
+      <w:tr>
+        <w:trPr>
+          <w:cantSplit/>
+        </w:trPr>
+        <w:tc>
+          <w:tcPr>
+            <w:tcW w:type="dxa" w:w="1601"/>
+          </w:tcPr>
+          <w:p>
+            <w:pPr>
+              <w:spacing w:before="0" w:after="0"/>
+            </w:pPr>
+            <w:r>
+              <w:rPr>
+                <w:b/>
+                <w:sz w:val="20"/>
+              </w:rPr>
+              <w:t>Trainer</w:t>
+            </w:r>
+          </w:p>
+        </w:tc>
+        <w:tc>
+          <w:tcPr>
+            <w:tcW w:type="dxa" w:w="6118"/>
+          </w:tcPr>
+          <w:p>
+            <w:pPr>
+              <w:spacing w:before="0" w:after="0"/>
+            </w:pPr>
+            <w:r>
+              <w:rPr>
+                <w:sz w:val="20"/>
+              </w:rPr>
+              <w:t>Coaching, feedback round, model solutions and assessment criteria.</w:t>
+            </w:r>
+          </w:p>
+        </w:tc>
+        <w:tc>
+          <w:tcPr>
+            <w:tcW w:type="dxa" w:w="1919"/>
+          </w:tcPr>
+          <w:p>
+            <w:pPr>
+              <w:spacing w:before="0" w:after="0"/>
+            </w:pPr>
+            <w:r>
+              <w:rPr>
+                <w:sz w:val="20"/>
+              </w:rPr>
+              <w:t>Trainer only</w:t>
+            </w:r>
+          </w:p>
+        </w:tc>
+      </w:tr>
+      <w:tr>
+        <w:trPr>
+          <w:cantSplit/>
+        </w:trPr>
+        <w:tc>
+          <w:tcPr>
+            <w:tcW w:type="dxa" w:w="1601"/>
+          </w:tcPr>
+          <w:p>
+            <w:pPr>
+              <w:spacing w:before="0" w:after="0"/>
+            </w:pPr>
+            <w:r>
+              <w:rPr>
+                <w:b/>
+                <w:sz w:val="20"/>
+              </w:rPr>
+              <w:t>Playground</w:t>
+            </w:r>
+          </w:p>
+        </w:tc>
+        <w:tc>
+          <w:tcPr>
+            <w:tcW w:type="dxa" w:w="6118"/>
+          </w:tcPr>
+          <w:p>
+            <w:pPr>
+              <w:spacing w:before="0" w:after="0"/>
+            </w:pPr>
+            <w:r>
+              <w:rPr>
+                <w:sz w:val="20"/>
+              </w:rPr>
+              <w:t>The course website (https://aion-dl.vercel.app/). In class it is the place to practise and learn: the cards and tasks are there too, and you can work in them directly.</w:t>
+            </w:r>
+          </w:p>
+        </w:tc>
+        <w:tc>
+          <w:tcPr>
+            <w:tcW w:type="dxa" w:w="1919"/>
+          </w:tcPr>
+          <w:p>
+            <w:pPr>
+              <w:spacing w:before="0" w:after="0"/>
+            </w:pPr>
+            <w:r>
+              <w:rPr>
+                <w:sz w:val="20"/>
+              </w:rPr>
+              <w:t>Everyone</w:t>
+            </w:r>
+          </w:p>
+        </w:tc>
+      </w:tr>
+    </w:tbl>
+    <w:p>
+      <w:pPr>
+        <w:spacing w:before="0" w:after="80"/>
+      </w:pPr>
+    </w:p>
+    <w:p>
+      <w:pPr>
+        <w:pStyle w:val="Heading2"/>
+      </w:pPr>
+      <w:r>
+        <w:rPr/>
+        <w:t>How we work</w:t>
+      </w:r>
+    </w:p>
+    <w:p>
+      <w:pPr>
+        <w:pStyle w:val="ListBullet"/>
+        <w:spacing w:before="0" w:after="40"/>
+      </w:pPr>
+      <w:r>
+        <w:rPr/>
+        <w:t xml:space="preserve">Blocks marked </w:t>
+      </w:r>
+      <w:r>
+        <w:rPr>
+          <w:b/>
+        </w:rPr>
+        <w:t>Core</w:t>
+      </w:r>
+      <w:r>
+        <w:rPr/>
+        <w:t xml:space="preserve"> are enough for a complete answer. Blocks and cards marked </w:t>
+      </w:r>
+      <w:r>
+        <w:rPr>
+          <w:b/>
+        </w:rPr>
+        <w:t>Optional</w:t>
+      </w:r>
+      <w:r>
+        <w:rPr/>
+        <w:t xml:space="preserve"> deepen a skill; no Core block needs them.</w:t>
+      </w:r>
+    </w:p>
+    <w:p>
+      <w:pPr>
+        <w:pStyle w:val="ListBullet"/>
+        <w:spacing w:before="0" w:after="40"/>
+      </w:pPr>
+      <w:r>
+        <w:rPr/>
+        <w:t>In the judged parts, a different choice with a clear reason is a good answer. The reason matters more than the result.</w:t>
+      </w:r>
+    </w:p>
+    <w:p>
+      <w:pPr>
+        <w:pStyle w:val="ListBullet"/>
+        <w:spacing w:before="0" w:after="40"/>
+      </w:pPr>
+      <w:r>
+        <w:rPr/>
+        <w:t>The worked examples in the Materi use another company than the task. No task answer is printed in the study material.</w:t>
+      </w:r>
+    </w:p>
+    <w:p>
+      <w:pPr>
+        <w:pStyle w:val="ListBullet"/>
+        <w:spacing w:before="0" w:after="100"/>
+      </w:pPr>
+      <w:r>
+        <w:rPr/>
+        <w:t>Every document names its version, its release date and the person who reviewed and approved it. Diagrams are AI-generated and are labelled on the image.</w:t>
+      </w:r>
+    </w:p>
+    <w:p>
+      <w:r>
+        <w:br w:type="page"/>
+      </w:r>
+    </w:p>
     <w:p>
       <w:pPr>
         <w:pStyle w:val="Heading1"/>
@@ -708,7 +4290,7 @@
       <w:r>
         <w:drawing>
           <wp:inline xmlns:a="http://schemas.openxmlformats.org/drawingml/2006/main" xmlns:pic="http://schemas.openxmlformats.org/drawingml/2006/picture">
-            <wp:extent cx="5940000" cy="2579210"/>
+            <wp:extent cx="5940000" cy="2766789"/>
             <wp:docPr id="1" name="Picture 1"/>
             <wp:cNvGraphicFramePr>
               <a:graphicFrameLocks noChangeAspect="1"/>
@@ -717,7 +4299,7 @@
               <a:graphicData uri="http://schemas.openxmlformats.org/drawingml/2006/picture">
                 <pic:pic>
                   <pic:nvPicPr>
-                    <pic:cNvPr id="0" name="d1_a1_ux-ui-layers.png"/>
+                    <pic:cNvPr id="0" name="d1_a1_ux-ui-layers-d6fabb0c4fc3.png"/>
                     <pic:cNvPicPr/>
                   </pic:nvPicPr>
                   <pic:blipFill>
@@ -729,7 +4311,7 @@
                   <pic:spPr>
                     <a:xfrm>
                       <a:off x="0" y="0"/>
-                      <a:ext cx="5940000" cy="2579210"/>
+                      <a:ext cx="5940000" cy="2766789"/>
                     </a:xfrm>
                     <a:prstGeom prst="rect"/>
                   </pic:spPr>
@@ -1139,7 +4721,7 @@
       <w:r>
         <w:drawing>
           <wp:inline xmlns:a="http://schemas.openxmlformats.org/drawingml/2006/main" xmlns:pic="http://schemas.openxmlformats.org/drawingml/2006/picture">
-            <wp:extent cx="5940000" cy="2501053"/>
+            <wp:extent cx="5940000" cy="2688632"/>
             <wp:docPr id="2" name="Picture 2"/>
             <wp:cNvGraphicFramePr>
               <a:graphicFrameLocks noChangeAspect="1"/>
@@ -1148,7 +4730,7 @@
               <a:graphicData uri="http://schemas.openxmlformats.org/drawingml/2006/picture">
                 <pic:pic>
                   <pic:nvPicPr>
-                    <pic:cNvPr id="0" name="d1_a2_system-vs-learner.png"/>
+                    <pic:cNvPr id="0" name="d1_a2_system-vs-learner-0e1ee24a0f74.png"/>
                     <pic:cNvPicPr/>
                   </pic:nvPicPr>
                   <pic:blipFill>
@@ -1160,7 +4742,7 @@
                   <pic:spPr>
                     <a:xfrm>
                       <a:off x="0" y="0"/>
-                      <a:ext cx="5940000" cy="2501053"/>
+                      <a:ext cx="5940000" cy="2688632"/>
                     </a:xfrm>
                     <a:prstGeom prst="rect"/>
                   </pic:spPr>
@@ -1918,7 +5500,7 @@
       <w:r>
         <w:drawing>
           <wp:inline xmlns:a="http://schemas.openxmlformats.org/drawingml/2006/main" xmlns:pic="http://schemas.openxmlformats.org/drawingml/2006/picture">
-            <wp:extent cx="5940000" cy="2813684"/>
+            <wp:extent cx="5940000" cy="3001263"/>
             <wp:docPr id="3" name="Picture 3"/>
             <wp:cNvGraphicFramePr>
               <a:graphicFrameLocks noChangeAspect="1"/>
@@ -1927,7 +5509,7 @@
               <a:graphicData uri="http://schemas.openxmlformats.org/drawingml/2006/picture">
                 <pic:pic>
                   <pic:nvPicPr>
-                    <pic:cNvPr id="0" name="d1_a3_lesson-screen.png"/>
+                    <pic:cNvPr id="0" name="d1_a3_lesson-screen-263e58396b7b.png"/>
                     <pic:cNvPicPr/>
                   </pic:nvPicPr>
                   <pic:blipFill>
@@ -1939,7 +5521,7 @@
                   <pic:spPr>
                     <a:xfrm>
                       <a:off x="0" y="0"/>
-                      <a:ext cx="5940000" cy="2813684"/>
+                      <a:ext cx="5940000" cy="3001263"/>
                     </a:xfrm>
                     <a:prstGeom prst="rect"/>
                   </pic:spPr>
@@ -3553,7 +7135,7 @@
       <w:r>
         <w:drawing>
           <wp:inline xmlns:a="http://schemas.openxmlformats.org/drawingml/2006/main" xmlns:pic="http://schemas.openxmlformats.org/drawingml/2006/picture">
-            <wp:extent cx="5940000" cy="1766368"/>
+            <wp:extent cx="5940000" cy="1953947"/>
             <wp:docPr id="4" name="Picture 4"/>
             <wp:cNvGraphicFramePr>
               <a:graphicFrameLocks noChangeAspect="1"/>
@@ -3562,7 +7144,7 @@
               <a:graphicData uri="http://schemas.openxmlformats.org/drawingml/2006/picture">
                 <pic:pic>
                   <pic:nvPicPr>
-                    <pic:cNvPr id="0" name="d1_a5_budget-effort.png"/>
+                    <pic:cNvPr id="0" name="d1_a5_budget-effort-8a0cb0a96b78.png"/>
                     <pic:cNvPicPr/>
                   </pic:nvPicPr>
                   <pic:blipFill>
@@ -3574,7 +7156,7 @@
                   <pic:spPr>
                     <a:xfrm>
                       <a:off x="0" y="0"/>
-                      <a:ext cx="5940000" cy="1766368"/>
+                      <a:ext cx="5940000" cy="1953947"/>
                     </a:xfrm>
                     <a:prstGeom prst="rect"/>
                   </pic:spPr>
@@ -4655,7 +8237,7 @@
       <w:r>
         <w:drawing>
           <wp:inline xmlns:a="http://schemas.openxmlformats.org/drawingml/2006/main" xmlns:pic="http://schemas.openxmlformats.org/drawingml/2006/picture">
-            <wp:extent cx="5940000" cy="1606145"/>
+            <wp:extent cx="5940000" cy="1793724"/>
             <wp:docPr id="5" name="Picture 5"/>
             <wp:cNvGraphicFramePr>
               <a:graphicFrameLocks noChangeAspect="1"/>
@@ -4664,7 +8246,7 @@
               <a:graphicData uri="http://schemas.openxmlformats.org/drawingml/2006/picture">
                 <pic:pic>
                   <pic:nvPicPr>
-                    <pic:cNvPr id="0" name="d1_b1_experience-to-number.png"/>
+                    <pic:cNvPr id="0" name="d1_b1_experience-to-number-f870be08e980.png"/>
                     <pic:cNvPicPr/>
                   </pic:nvPicPr>
                   <pic:blipFill>
@@ -4676,7 +8258,7 @@
                   <pic:spPr>
                     <a:xfrm>
                       <a:off x="0" y="0"/>
-                      <a:ext cx="5940000" cy="1606145"/>
+                      <a:ext cx="5940000" cy="1793724"/>
                     </a:xfrm>
                     <a:prstGeom prst="rect"/>
                   </pic:spPr>
@@ -5278,7 +8860,7 @@
       <w:r>
         <w:drawing>
           <wp:inline xmlns:a="http://schemas.openxmlformats.org/drawingml/2006/main" xmlns:pic="http://schemas.openxmlformats.org/drawingml/2006/picture">
-            <wp:extent cx="5940000" cy="3470211"/>
+            <wp:extent cx="5940000" cy="3657789"/>
             <wp:docPr id="6" name="Picture 6"/>
             <wp:cNvGraphicFramePr>
               <a:graphicFrameLocks noChangeAspect="1"/>
@@ -5287,7 +8869,7 @@
               <a:graphicData uri="http://schemas.openxmlformats.org/drawingml/2006/picture">
                 <pic:pic>
                   <pic:nvPicPr>
-                    <pic:cNvPr id="0" name="d1_b2_user-vs-business.png"/>
+                    <pic:cNvPr id="0" name="d1_b2_user-vs-business-9989f526b580.png"/>
                     <pic:cNvPicPr/>
                   </pic:nvPicPr>
                   <pic:blipFill>
@@ -5299,7 +8881,7 @@
                   <pic:spPr>
                     <a:xfrm>
                       <a:off x="0" y="0"/>
-                      <a:ext cx="5940000" cy="3470211"/>
+                      <a:ext cx="5940000" cy="3657789"/>
                     </a:xfrm>
                     <a:prstGeom prst="rect"/>
                   </pic:spPr>
@@ -6238,7 +9820,7 @@
       <w:r>
         <w:drawing>
           <wp:inline xmlns:a="http://schemas.openxmlformats.org/drawingml/2006/main" xmlns:pic="http://schemas.openxmlformats.org/drawingml/2006/picture">
-            <wp:extent cx="5940000" cy="2657368"/>
+            <wp:extent cx="5940000" cy="2844947"/>
             <wp:docPr id="7" name="Picture 7"/>
             <wp:cNvGraphicFramePr>
               <a:graphicFrameLocks noChangeAspect="1"/>
@@ -6247,7 +9829,7 @@
               <a:graphicData uri="http://schemas.openxmlformats.org/drawingml/2006/picture">
                 <pic:pic>
                   <pic:nvPicPr>
-                    <pic:cNvPr id="0" name="d1_b3_decision-frame.png"/>
+                    <pic:cNvPr id="0" name="d1_b3_decision-frame-109cce78d674.png"/>
                     <pic:cNvPicPr/>
                   </pic:nvPicPr>
                   <pic:blipFill>
@@ -6259,7 +9841,7 @@
                   <pic:spPr>
                     <a:xfrm>
                       <a:off x="0" y="0"/>
-                      <a:ext cx="5940000" cy="2657368"/>
+                      <a:ext cx="5940000" cy="2844947"/>
                     </a:xfrm>
                     <a:prstGeom prst="rect"/>
                   </pic:spPr>
@@ -6526,6 +10108,622 @@
         </w:rPr>
         <w:t>Klein 2007 · Gibbons 2018 (NN/g) · Bezos 2016</w:t>
       </w:r>
+    </w:p>
+    <w:p>
+      <w:r>
+        <w:br w:type="page"/>
+      </w:r>
+    </w:p>
+    <w:p>
+      <w:pPr>
+        <w:pStyle w:val="Heading1"/>
+        <w:pBdr>
+          <w:bottom w:val="single" w:sz="8" w:space="2" w:color="17212E"/>
+        </w:pBdr>
+      </w:pPr>
+      <w:r>
+        <w:rPr/>
+        <w:t>Use in class: presentation and handout</w:t>
+      </w:r>
+    </w:p>
+    <w:p>
+      <w:pPr>
+        <w:spacing w:before="0" w:after="100"/>
+      </w:pPr>
+      <w:r>
+        <w:rPr/>
+        <w:t xml:space="preserve">Mark of use for the study material. </w:t>
+      </w:r>
+      <w:r>
+        <w:rPr>
+          <w:b/>
+        </w:rPr>
+        <w:t>Presentation</w:t>
+      </w:r>
+      <w:r>
+        <w:rPr/>
+        <w:t xml:space="preserve"> is what the trainer shows on screen; </w:t>
+      </w:r>
+      <w:r>
+        <w:rPr>
+          <w:b/>
+        </w:rPr>
+        <w:t>Handout</w:t>
+      </w:r>
+      <w:r>
+        <w:rPr/>
+        <w:t xml:space="preserve"> is what participants read and keep.</w:t>
+      </w:r>
+    </w:p>
+    <w:tbl>
+      <w:tblPr>
+        <w:tblW w:w="9638" w:type="dxa"/>
+        <w:tblBorders>
+          <w:top w:val="single" w:sz="4" w:space="0" w:color="D5DEE9"/>
+          <w:left w:val="single" w:sz="4" w:space="0" w:color="D5DEE9"/>
+          <w:bottom w:val="single" w:sz="4" w:space="0" w:color="D5DEE9"/>
+          <w:right w:val="single" w:sz="4" w:space="0" w:color="D5DEE9"/>
+          <w:insideH w:val="single" w:sz="4" w:space="0" w:color="D5DEE9"/>
+          <w:insideV w:val="single" w:sz="4" w:space="0" w:color="D5DEE9"/>
+        </w:tblBorders>
+        <w:tblLayout w:type="fixed"/>
+        <w:tblCellMar>
+          <w:top w:w="60" w:type="dxa"/>
+          <w:left w:w="100" w:type="dxa"/>
+          <w:bottom w:w="60" w:type="dxa"/>
+          <w:right w:w="100" w:type="dxa"/>
+        </w:tblCellMar>
+      </w:tblPr>
+      <w:tblGrid>
+        <w:gridCol w:w="3807"/>
+        <w:gridCol w:w="4242"/>
+        <w:gridCol w:w="1589"/>
+      </w:tblGrid>
+      <w:tr>
+        <w:trPr>
+          <w:cantSplit/>
+          <w:tblHeader/>
+        </w:trPr>
+        <w:tc>
+          <w:tcPr>
+            <w:tcW w:type="dxa" w:w="3807"/>
+            <w:shd w:val="clear" w:color="auto" w:fill="E6ECF4"/>
+          </w:tcPr>
+          <w:p>
+            <w:pPr>
+              <w:spacing w:before="0" w:after="0"/>
+            </w:pPr>
+            <w:r>
+              <w:rPr>
+                <w:b/>
+                <w:sz w:val="20"/>
+              </w:rPr>
+              <w:t>Card</w:t>
+            </w:r>
+          </w:p>
+        </w:tc>
+        <w:tc>
+          <w:tcPr>
+            <w:tcW w:type="dxa" w:w="4242"/>
+            <w:shd w:val="clear" w:color="auto" w:fill="E6ECF4"/>
+          </w:tcPr>
+          <w:p>
+            <w:pPr>
+              <w:spacing w:before="0" w:after="0"/>
+            </w:pPr>
+            <w:r>
+              <w:rPr>
+                <w:b/>
+                <w:sz w:val="20"/>
+              </w:rPr>
+              <w:t>Presentation (shown on the playground)</w:t>
+            </w:r>
+          </w:p>
+        </w:tc>
+        <w:tc>
+          <w:tcPr>
+            <w:tcW w:type="dxa" w:w="1589"/>
+            <w:shd w:val="clear" w:color="auto" w:fill="E6ECF4"/>
+          </w:tcPr>
+          <w:p>
+            <w:pPr>
+              <w:spacing w:before="0" w:after="0"/>
+            </w:pPr>
+            <w:r>
+              <w:rPr>
+                <w:b/>
+                <w:sz w:val="20"/>
+              </w:rPr>
+              <w:t>Handout</w:t>
+            </w:r>
+          </w:p>
+        </w:tc>
+      </w:tr>
+      <w:tr>
+        <w:trPr>
+          <w:cantSplit/>
+        </w:trPr>
+        <w:tc>
+          <w:tcPr>
+            <w:tcW w:type="dxa" w:w="3807"/>
+          </w:tcPr>
+          <w:p>
+            <w:pPr>
+              <w:spacing w:before="0" w:after="0"/>
+            </w:pPr>
+            <w:r>
+              <w:rPr>
+                <w:b/>
+                <w:sz w:val="20"/>
+              </w:rPr>
+              <w:t>A1</w:t>
+            </w:r>
+            <w:r>
+              <w:rPr>
+                <w:sz w:val="20"/>
+              </w:rPr>
+              <w:t xml:space="preserve"> · UX is the experience, UI is the surface (Core)</w:t>
+            </w:r>
+          </w:p>
+        </w:tc>
+        <w:tc>
+          <w:tcPr>
+            <w:tcW w:type="dxa" w:w="4242"/>
+          </w:tcPr>
+          <w:p>
+            <w:pPr>
+              <w:spacing w:before="0" w:after="0"/>
+            </w:pPr>
+            <w:r>
+              <w:rPr>
+                <w:sz w:val="20"/>
+              </w:rPr>
+              <w:t>Scan line and Figure 1; the "In plain words" and "How to decide" boxes</w:t>
+            </w:r>
+          </w:p>
+        </w:tc>
+        <w:tc>
+          <w:tcPr>
+            <w:tcW w:type="dxa" w:w="1589"/>
+          </w:tcPr>
+          <w:p>
+            <w:pPr>
+              <w:spacing w:before="0" w:after="0"/>
+            </w:pPr>
+            <w:r>
+              <w:rPr>
+                <w:sz w:val="20"/>
+              </w:rPr>
+              <w:t>The whole card</w:t>
+            </w:r>
+          </w:p>
+        </w:tc>
+      </w:tr>
+      <w:tr>
+        <w:trPr>
+          <w:cantSplit/>
+        </w:trPr>
+        <w:tc>
+          <w:tcPr>
+            <w:tcW w:type="dxa" w:w="3807"/>
+          </w:tcPr>
+          <w:p>
+            <w:pPr>
+              <w:spacing w:before="0" w:after="0"/>
+            </w:pPr>
+            <w:r>
+              <w:rPr>
+                <w:b/>
+                <w:sz w:val="20"/>
+              </w:rPr>
+              <w:t>A2</w:t>
+            </w:r>
+            <w:r>
+              <w:rPr>
+                <w:sz w:val="20"/>
+              </w:rPr>
+              <w:t xml:space="preserve"> · Design from the learner's need, not from the system's logic (Core)</w:t>
+            </w:r>
+          </w:p>
+        </w:tc>
+        <w:tc>
+          <w:tcPr>
+            <w:tcW w:type="dxa" w:w="4242"/>
+          </w:tcPr>
+          <w:p>
+            <w:pPr>
+              <w:spacing w:before="0" w:after="0"/>
+            </w:pPr>
+            <w:r>
+              <w:rPr>
+                <w:sz w:val="20"/>
+              </w:rPr>
+              <w:t>Scan line and Figure 2; the "In plain words" and "How to decide" boxes</w:t>
+            </w:r>
+          </w:p>
+        </w:tc>
+        <w:tc>
+          <w:tcPr>
+            <w:tcW w:type="dxa" w:w="1589"/>
+          </w:tcPr>
+          <w:p>
+            <w:pPr>
+              <w:spacing w:before="0" w:after="0"/>
+            </w:pPr>
+            <w:r>
+              <w:rPr>
+                <w:sz w:val="20"/>
+              </w:rPr>
+              <w:t>The whole card</w:t>
+            </w:r>
+          </w:p>
+        </w:tc>
+      </w:tr>
+      <w:tr>
+        <w:trPr>
+          <w:cantSplit/>
+        </w:trPr>
+        <w:tc>
+          <w:tcPr>
+            <w:tcW w:type="dxa" w:w="3807"/>
+          </w:tcPr>
+          <w:p>
+            <w:pPr>
+              <w:spacing w:before="0" w:after="0"/>
+            </w:pPr>
+            <w:r>
+              <w:rPr>
+                <w:b/>
+                <w:sz w:val="20"/>
+              </w:rPr>
+              <w:t>A3</w:t>
+            </w:r>
+            <w:r>
+              <w:rPr>
+                <w:sz w:val="20"/>
+              </w:rPr>
+              <w:t xml:space="preserve"> · Three principles of a good learning interface (Core)</w:t>
+            </w:r>
+          </w:p>
+        </w:tc>
+        <w:tc>
+          <w:tcPr>
+            <w:tcW w:type="dxa" w:w="4242"/>
+          </w:tcPr>
+          <w:p>
+            <w:pPr>
+              <w:spacing w:before="0" w:after="0"/>
+            </w:pPr>
+            <w:r>
+              <w:rPr>
+                <w:sz w:val="20"/>
+              </w:rPr>
+              <w:t>Scan line and Figure 3; the "In plain words" and "How to decide" boxes</w:t>
+            </w:r>
+          </w:p>
+        </w:tc>
+        <w:tc>
+          <w:tcPr>
+            <w:tcW w:type="dxa" w:w="1589"/>
+          </w:tcPr>
+          <w:p>
+            <w:pPr>
+              <w:spacing w:before="0" w:after="0"/>
+            </w:pPr>
+            <w:r>
+              <w:rPr>
+                <w:sz w:val="20"/>
+              </w:rPr>
+              <w:t>The whole card</w:t>
+            </w:r>
+          </w:p>
+        </w:tc>
+      </w:tr>
+      <w:tr>
+        <w:trPr>
+          <w:cantSplit/>
+        </w:trPr>
+        <w:tc>
+          <w:tcPr>
+            <w:tcW w:type="dxa" w:w="3807"/>
+          </w:tcPr>
+          <w:p>
+            <w:pPr>
+              <w:spacing w:before="0" w:after="0"/>
+            </w:pPr>
+            <w:r>
+              <w:rPr>
+                <w:b/>
+                <w:sz w:val="20"/>
+              </w:rPr>
+              <w:t>A4</w:t>
+            </w:r>
+            <w:r>
+              <w:rPr>
+                <w:sz w:val="20"/>
+              </w:rPr>
+              <w:t xml:space="preserve"> · A learning platform is not a classic app (Optional)</w:t>
+            </w:r>
+          </w:p>
+        </w:tc>
+        <w:tc>
+          <w:tcPr>
+            <w:tcW w:type="dxa" w:w="4242"/>
+          </w:tcPr>
+          <w:p>
+            <w:pPr>
+              <w:spacing w:before="0" w:after="0"/>
+            </w:pPr>
+            <w:r>
+              <w:rPr>
+                <w:sz w:val="20"/>
+              </w:rPr>
+              <w:t>Not shown (self-study)</w:t>
+            </w:r>
+          </w:p>
+        </w:tc>
+        <w:tc>
+          <w:tcPr>
+            <w:tcW w:type="dxa" w:w="1589"/>
+          </w:tcPr>
+          <w:p>
+            <w:pPr>
+              <w:spacing w:before="0" w:after="0"/>
+            </w:pPr>
+            <w:r>
+              <w:rPr>
+                <w:sz w:val="20"/>
+              </w:rPr>
+              <w:t>The whole card</w:t>
+            </w:r>
+          </w:p>
+        </w:tc>
+      </w:tr>
+      <w:tr>
+        <w:trPr>
+          <w:cantSplit/>
+        </w:trPr>
+        <w:tc>
+          <w:tcPr>
+            <w:tcW w:type="dxa" w:w="3807"/>
+          </w:tcPr>
+          <w:p>
+            <w:pPr>
+              <w:spacing w:before="0" w:after="0"/>
+            </w:pPr>
+            <w:r>
+              <w:rPr>
+                <w:b/>
+                <w:sz w:val="20"/>
+              </w:rPr>
+              <w:t>A5</w:t>
+            </w:r>
+            <w:r>
+              <w:rPr>
+                <w:sz w:val="20"/>
+              </w:rPr>
+              <w:t xml:space="preserve"> · Weighing a measure: user impact, effort, risk (Core)</w:t>
+            </w:r>
+          </w:p>
+        </w:tc>
+        <w:tc>
+          <w:tcPr>
+            <w:tcW w:type="dxa" w:w="4242"/>
+          </w:tcPr>
+          <w:p>
+            <w:pPr>
+              <w:spacing w:before="0" w:after="0"/>
+            </w:pPr>
+            <w:r>
+              <w:rPr>
+                <w:sz w:val="20"/>
+              </w:rPr>
+              <w:t>Scan line and Figure 4; the "In plain words" and "How to decide" boxes</w:t>
+            </w:r>
+          </w:p>
+        </w:tc>
+        <w:tc>
+          <w:tcPr>
+            <w:tcW w:type="dxa" w:w="1589"/>
+          </w:tcPr>
+          <w:p>
+            <w:pPr>
+              <w:spacing w:before="0" w:after="0"/>
+            </w:pPr>
+            <w:r>
+              <w:rPr>
+                <w:sz w:val="20"/>
+              </w:rPr>
+              <w:t>The whole card</w:t>
+            </w:r>
+          </w:p>
+        </w:tc>
+      </w:tr>
+      <w:tr>
+        <w:trPr>
+          <w:cantSplit/>
+        </w:trPr>
+        <w:tc>
+          <w:tcPr>
+            <w:tcW w:type="dxa" w:w="3807"/>
+          </w:tcPr>
+          <w:p>
+            <w:pPr>
+              <w:spacing w:before="0" w:after="0"/>
+            </w:pPr>
+            <w:r>
+              <w:rPr>
+                <w:b/>
+                <w:sz w:val="20"/>
+              </w:rPr>
+              <w:t>B1</w:t>
+            </w:r>
+            <w:r>
+              <w:rPr>
+                <w:sz w:val="20"/>
+              </w:rPr>
+              <w:t xml:space="preserve"> · Why UX matters to the business (Core)</w:t>
+            </w:r>
+          </w:p>
+        </w:tc>
+        <w:tc>
+          <w:tcPr>
+            <w:tcW w:type="dxa" w:w="4242"/>
+          </w:tcPr>
+          <w:p>
+            <w:pPr>
+              <w:spacing w:before="0" w:after="0"/>
+            </w:pPr>
+            <w:r>
+              <w:rPr>
+                <w:sz w:val="20"/>
+              </w:rPr>
+              <w:t>Scan line and Figure 5; the "In plain words" and "How to decide" boxes</w:t>
+            </w:r>
+          </w:p>
+        </w:tc>
+        <w:tc>
+          <w:tcPr>
+            <w:tcW w:type="dxa" w:w="1589"/>
+          </w:tcPr>
+          <w:p>
+            <w:pPr>
+              <w:spacing w:before="0" w:after="0"/>
+            </w:pPr>
+            <w:r>
+              <w:rPr>
+                <w:sz w:val="20"/>
+              </w:rPr>
+              <w:t>The whole card</w:t>
+            </w:r>
+          </w:p>
+        </w:tc>
+      </w:tr>
+      <w:tr>
+        <w:trPr>
+          <w:cantSplit/>
+        </w:trPr>
+        <w:tc>
+          <w:tcPr>
+            <w:tcW w:type="dxa" w:w="3807"/>
+          </w:tcPr>
+          <w:p>
+            <w:pPr>
+              <w:spacing w:before="0" w:after="0"/>
+            </w:pPr>
+            <w:r>
+              <w:rPr>
+                <w:b/>
+                <w:sz w:val="20"/>
+              </w:rPr>
+              <w:t>B2</w:t>
+            </w:r>
+            <w:r>
+              <w:rPr>
+                <w:sz w:val="20"/>
+              </w:rPr>
+              <w:t xml:space="preserve"> · Conflicting goals: user value, effort and business goals (Core)</w:t>
+            </w:r>
+          </w:p>
+        </w:tc>
+        <w:tc>
+          <w:tcPr>
+            <w:tcW w:type="dxa" w:w="4242"/>
+          </w:tcPr>
+          <w:p>
+            <w:pPr>
+              <w:spacing w:before="0" w:after="0"/>
+            </w:pPr>
+            <w:r>
+              <w:rPr>
+                <w:sz w:val="20"/>
+              </w:rPr>
+              <w:t>Scan line and Figure 6; the "In plain words" and "How to decide" boxes</w:t>
+            </w:r>
+          </w:p>
+        </w:tc>
+        <w:tc>
+          <w:tcPr>
+            <w:tcW w:type="dxa" w:w="1589"/>
+          </w:tcPr>
+          <w:p>
+            <w:pPr>
+              <w:spacing w:before="0" w:after="0"/>
+            </w:pPr>
+            <w:r>
+              <w:rPr>
+                <w:sz w:val="20"/>
+              </w:rPr>
+              <w:t>The whole card</w:t>
+            </w:r>
+          </w:p>
+        </w:tc>
+      </w:tr>
+      <w:tr>
+        <w:trPr>
+          <w:cantSplit/>
+        </w:trPr>
+        <w:tc>
+          <w:tcPr>
+            <w:tcW w:type="dxa" w:w="3807"/>
+          </w:tcPr>
+          <w:p>
+            <w:pPr>
+              <w:spacing w:before="0" w:after="0"/>
+            </w:pPr>
+            <w:r>
+              <w:rPr>
+                <w:b/>
+                <w:sz w:val="20"/>
+              </w:rPr>
+              <w:t>B3</w:t>
+            </w:r>
+            <w:r>
+              <w:rPr>
+                <w:sz w:val="20"/>
+              </w:rPr>
+              <w:t xml:space="preserve"> · Deciding when you do not know enough (Core)</w:t>
+            </w:r>
+          </w:p>
+        </w:tc>
+        <w:tc>
+          <w:tcPr>
+            <w:tcW w:type="dxa" w:w="4242"/>
+          </w:tcPr>
+          <w:p>
+            <w:pPr>
+              <w:spacing w:before="0" w:after="0"/>
+            </w:pPr>
+            <w:r>
+              <w:rPr>
+                <w:sz w:val="20"/>
+              </w:rPr>
+              <w:t>Scan line and Figure 7; the "In plain words" and "How to decide" boxes</w:t>
+            </w:r>
+          </w:p>
+        </w:tc>
+        <w:tc>
+          <w:tcPr>
+            <w:tcW w:type="dxa" w:w="1589"/>
+          </w:tcPr>
+          <w:p>
+            <w:pPr>
+              <w:spacing w:before="0" w:after="0"/>
+            </w:pPr>
+            <w:r>
+              <w:rPr>
+                <w:sz w:val="20"/>
+              </w:rPr>
+              <w:t>The whole card</w:t>
+            </w:r>
+          </w:p>
+        </w:tc>
+      </w:tr>
+    </w:tbl>
+    <w:p>
+      <w:pPr>
+        <w:spacing w:before="0" w:after="80"/>
+      </w:pPr>
     </w:p>
     <w:p>
       <w:pPr>
@@ -9248,6 +13446,186 @@
         <w:spacing w:before="0" w:after="80"/>
       </w:pPr>
     </w:p>
+    <w:p>
+      <w:r>
+        <w:br w:type="page"/>
+      </w:r>
+    </w:p>
+    <w:p>
+      <w:pPr>
+        <w:pStyle w:val="Heading1"/>
+        <w:pBdr>
+          <w:bottom w:val="single" w:sz="8" w:space="2" w:color="17212E"/>
+        </w:pBdr>
+      </w:pPr>
+      <w:r>
+        <w:rPr/>
+        <w:t>The playground: where we practise online</w:t>
+      </w:r>
+    </w:p>
+    <w:p>
+      <w:pPr>
+        <w:spacing w:before="0" w:after="100"/>
+      </w:pPr>
+      <w:r>
+        <w:rPr/>
+        <w:t>In class we use the course website as the place to practise and to learn. Every day has its own address, in the same pattern: the day number is the last part.</w:t>
+      </w:r>
+    </w:p>
+    <w:tbl>
+      <w:tblPr>
+        <w:tblW w:w="9638" w:type="dxa"/>
+        <w:tblBorders>
+          <w:top w:val="single" w:sz="4" w:space="0" w:color="D5DEE9"/>
+          <w:left w:val="single" w:sz="4" w:space="0" w:color="D5DEE9"/>
+          <w:bottom w:val="single" w:sz="4" w:space="0" w:color="D5DEE9"/>
+          <w:right w:val="single" w:sz="4" w:space="0" w:color="D5DEE9"/>
+          <w:insideH w:val="single" w:sz="4" w:space="0" w:color="D5DEE9"/>
+          <w:insideV w:val="single" w:sz="4" w:space="0" w:color="D5DEE9"/>
+        </w:tblBorders>
+        <w:tblLayout w:type="fixed"/>
+        <w:tblCellMar>
+          <w:top w:w="60" w:type="dxa"/>
+          <w:left w:w="100" w:type="dxa"/>
+          <w:bottom w:w="60" w:type="dxa"/>
+          <w:right w:w="100" w:type="dxa"/>
+        </w:tblCellMar>
+      </w:tblPr>
+      <w:tblGrid>
+        <w:gridCol w:w="3030"/>
+        <w:gridCol w:w="6608"/>
+      </w:tblGrid>
+      <w:tr>
+        <w:trPr>
+          <w:cantSplit/>
+          <w:tblHeader/>
+        </w:trPr>
+        <w:tc>
+          <w:tcPr>
+            <w:tcW w:type="dxa" w:w="3030"/>
+            <w:shd w:val="clear" w:color="auto" w:fill="E6ECF4"/>
+          </w:tcPr>
+          <w:p>
+            <w:pPr>
+              <w:spacing w:before="0" w:after="0"/>
+            </w:pPr>
+            <w:r>
+              <w:rPr>
+                <w:b/>
+                <w:sz w:val="20"/>
+              </w:rPr>
+              <w:t>What</w:t>
+            </w:r>
+          </w:p>
+        </w:tc>
+        <w:tc>
+          <w:tcPr>
+            <w:tcW w:type="dxa" w:w="6608"/>
+            <w:shd w:val="clear" w:color="auto" w:fill="E6ECF4"/>
+          </w:tcPr>
+          <w:p>
+            <w:pPr>
+              <w:spacing w:before="0" w:after="0"/>
+            </w:pPr>
+            <w:r>
+              <w:rPr>
+                <w:b/>
+                <w:sz w:val="20"/>
+              </w:rPr>
+              <w:t>Address</w:t>
+            </w:r>
+          </w:p>
+        </w:tc>
+      </w:tr>
+      <w:tr>
+        <w:trPr>
+          <w:cantSplit/>
+        </w:trPr>
+        <w:tc>
+          <w:tcPr>
+            <w:tcW w:type="dxa" w:w="3030"/>
+          </w:tcPr>
+          <w:p>
+            <w:pPr>
+              <w:spacing w:before="0" w:after="0"/>
+            </w:pPr>
+            <w:r>
+              <w:rPr>
+                <w:sz w:val="20"/>
+              </w:rPr>
+              <w:t>Course website (playground)</w:t>
+            </w:r>
+          </w:p>
+        </w:tc>
+        <w:tc>
+          <w:tcPr>
+            <w:tcW w:type="dxa" w:w="6608"/>
+          </w:tcPr>
+          <w:p>
+            <w:pPr>
+              <w:spacing w:before="0" w:after="0"/>
+            </w:pPr>
+            <w:r>
+              <w:rPr>
+                <w:sz w:val="20"/>
+              </w:rPr>
+              <w:t>https://aion-dl.vercel.app/</w:t>
+            </w:r>
+          </w:p>
+        </w:tc>
+      </w:tr>
+      <w:tr>
+        <w:trPr>
+          <w:cantSplit/>
+        </w:trPr>
+        <w:tc>
+          <w:tcPr>
+            <w:tcW w:type="dxa" w:w="3030"/>
+          </w:tcPr>
+          <w:p>
+            <w:pPr>
+              <w:spacing w:before="0" w:after="0"/>
+            </w:pPr>
+            <w:r>
+              <w:rPr>
+                <w:sz w:val="20"/>
+              </w:rPr>
+              <w:t>Day 1</w:t>
+            </w:r>
+          </w:p>
+        </w:tc>
+        <w:tc>
+          <w:tcPr>
+            <w:tcW w:type="dxa" w:w="6608"/>
+          </w:tcPr>
+          <w:p>
+            <w:pPr>
+              <w:spacing w:before="0" w:after="0"/>
+            </w:pPr>
+            <w:r>
+              <w:rPr>
+                <w:sz w:val="20"/>
+              </w:rPr>
+              <w:t>https://aion-dl.vercel.app/day/1/</w:t>
+            </w:r>
+          </w:p>
+        </w:tc>
+      </w:tr>
+    </w:tbl>
+    <w:p>
+      <w:pPr>
+        <w:spacing w:before="0" w:after="80"/>
+      </w:pPr>
+    </w:p>
+    <w:p>
+      <w:pPr>
+        <w:spacing w:before="0" w:after="100"/>
+      </w:pPr>
+      <w:r>
+        <w:rPr/>
+        <w:t>On the day page, Route 1 (Levels 1 and 2) and Route 2 (Level 3) can be opened; the cards and the tasks of this document are there too. The pattern is the same up to Day 8, for example https://aion-dl.vercel.app/day/6/.</w:t>
+      </w:r>
+    </w:p>
     <w:sectPr>
       <w:footerReference w:type="default" r:id="rId9"/>
       <w:pgSz w:w="11906" w:h="16838"/>
@@ -9274,7 +13652,7 @@
         <w:color w:val="556274"/>
         <w:sz w:val="17"/>
       </w:rPr>
-      <w:t xml:space="preserve">Habmann AufstiegsAkademie · Digital Learning · Day 1 · Materi   ·   Page </w:t>
+      <w:t xml:space="preserve">Habmann AufstiegsAkademie · Day 1 · Materi · v1.1 · 14.10.2026   ·   Page </w:t>
     </w:r>
     <w:r>
       <w:rPr>

</xml_diff>